<commit_message>
feat: atividade de ip e material base
</commit_message>
<xml_diff>
--- a/3° Módulo/BD III - Banco de Dados/exercicios_SQL/exercicios_SQL_BD3.docx
+++ b/3° Módulo/BD III - Banco de Dados/exercicios_SQL/exercicios_SQL_BD3.docx
@@ -811,12 +811,16 @@
     <w:p>
       <w:pPr>
         <w:rPr>
-          <w:noProof/>
-          <w:lang w:eastAsia="pt-BR"/>
-        </w:rPr>
-      </w:pPr>
-      <w:r>
-        <w:rPr>
+          <w:b/>
+          <w:bCs/>
+          <w:noProof/>
+          <w:lang w:eastAsia="pt-BR"/>
+        </w:rPr>
+      </w:pPr>
+      <w:r>
+        <w:rPr>
+          <w:b/>
+          <w:bCs/>
           <w:noProof/>
           <w:lang w:eastAsia="pt-BR"/>
         </w:rPr>
@@ -884,12 +888,16 @@
     <w:p>
       <w:pPr>
         <w:rPr>
-          <w:noProof/>
-          <w:lang w:eastAsia="pt-BR"/>
-        </w:rPr>
-      </w:pPr>
-      <w:r>
-        <w:rPr>
+          <w:b/>
+          <w:bCs/>
+          <w:noProof/>
+          <w:lang w:eastAsia="pt-BR"/>
+        </w:rPr>
+      </w:pPr>
+      <w:r>
+        <w:rPr>
+          <w:b/>
+          <w:bCs/>
           <w:noProof/>
           <w:lang w:eastAsia="pt-BR"/>
         </w:rPr>
@@ -930,12 +938,16 @@
     <w:p>
       <w:pPr>
         <w:rPr>
-          <w:noProof/>
-          <w:lang w:eastAsia="pt-BR"/>
-        </w:rPr>
-      </w:pPr>
-      <w:r>
-        <w:rPr>
+          <w:b/>
+          <w:bCs/>
+          <w:noProof/>
+          <w:lang w:eastAsia="pt-BR"/>
+        </w:rPr>
+      </w:pPr>
+      <w:r>
+        <w:rPr>
+          <w:b/>
+          <w:bCs/>
           <w:noProof/>
           <w:lang w:eastAsia="pt-BR"/>
         </w:rPr>
@@ -1078,12 +1090,16 @@
     <w:p>
       <w:pPr>
         <w:rPr>
-          <w:noProof/>
-          <w:lang w:eastAsia="pt-BR"/>
-        </w:rPr>
-      </w:pPr>
-      <w:r>
-        <w:rPr>
+          <w:b/>
+          <w:bCs/>
+          <w:noProof/>
+          <w:lang w:eastAsia="pt-BR"/>
+        </w:rPr>
+      </w:pPr>
+      <w:r>
+        <w:rPr>
+          <w:b/>
+          <w:bCs/>
           <w:noProof/>
           <w:lang w:eastAsia="pt-BR"/>
         </w:rPr>
@@ -1152,6 +1168,13 @@
           <w:lang w:eastAsia="pt-BR"/>
         </w:rPr>
         <w:lastRenderedPageBreak/>
+        <w:t xml:space="preserve">Questão 7 - </w:t>
+      </w:r>
+      <w:r>
+        <w:rPr>
+          <w:noProof/>
+          <w:lang w:eastAsia="pt-BR"/>
+        </w:rPr>
         <w:t>Problema:</w:t>
       </w:r>
     </w:p>
@@ -1168,6 +1191,616 @@
           <w:lang w:eastAsia="pt-BR"/>
         </w:rPr>
         <w:t>Mostre os nome de todos os vendedores que venderam Chapa de Aco em quantidade superior a 300 Kg.</w:t>
+      </w:r>
+    </w:p>
+    <w:p>
+      <w:pPr>
+        <w:rPr>
+          <w:noProof/>
+          <w:lang w:eastAsia="pt-BR"/>
+        </w:rPr>
+      </w:pPr>
+    </w:p>
+    <w:p>
+      <w:pPr>
+        <w:spacing w:line="278" w:lineRule="auto"/>
+        <w:ind w:firstLine="0"/>
+        <w:jc w:val="left"/>
+        <w:rPr>
+          <w:noProof/>
+          <w:lang w:eastAsia="pt-BR"/>
+        </w:rPr>
+      </w:pPr>
+      <w:r>
+        <w:rPr>
+          <w:noProof/>
+          <w:lang w:eastAsia="pt-BR"/>
+        </w:rPr>
+        <w:br w:type="page"/>
+      </w:r>
+    </w:p>
+    <w:p>
+      <w:pPr>
+        <w:rPr>
+          <w:noProof/>
+          <w:lang w:eastAsia="pt-BR"/>
+        </w:rPr>
+      </w:pPr>
+      <w:r>
+        <w:rPr>
+          <w:noProof/>
+          <w:lang w:eastAsia="pt-BR"/>
+        </w:rPr>
+        <w:lastRenderedPageBreak/>
+        <w:t xml:space="preserve">Questao 8 - </w:t>
+      </w:r>
+      <w:r>
+        <w:rPr>
+          <w:noProof/>
+          <w:lang w:eastAsia="pt-BR"/>
+        </w:rPr>
+        <w:t>Problema:</w:t>
+      </w:r>
+    </w:p>
+    <w:p>
+      <w:pPr>
+        <w:rPr>
+          <w:noProof/>
+          <w:lang w:eastAsia="pt-BR"/>
+        </w:rPr>
+      </w:pPr>
+      <w:r>
+        <w:rPr>
+          <w:noProof/>
+          <w:lang w:eastAsia="pt-BR"/>
+        </w:rPr>
+        <w:t>Quantos clientes das cidades do Rio de Janeiro e Niterói tiveram seus pedidos tirados com a vendedora Ana Cristina?</w:t>
+      </w:r>
+    </w:p>
+    <w:p>
+      <w:pPr>
+        <w:rPr>
+          <w:noProof/>
+          <w:lang w:eastAsia="pt-BR"/>
+        </w:rPr>
+      </w:pPr>
+      <w:r>
+        <w:rPr>
+          <w:noProof/>
+          <w:lang w:eastAsia="pt-BR"/>
+        </w:rPr>
+        <w:t>select C.cidade, count (distinct cod_cli) as num_clientes from cliente C, pedido P, vendedor V where C.cod_cli=P.cd_cli and C.cidade in ('rio de janeiro', 'niteroi') and p.cd_vend=V.cod_vend and V.nome_vend='Ana Cristina'</w:t>
+      </w:r>
+    </w:p>
+    <w:p>
+      <w:pPr>
+        <w:rPr>
+          <w:noProof/>
+          <w:lang w:eastAsia="pt-BR"/>
+        </w:rPr>
+      </w:pPr>
+      <w:r>
+        <w:rPr>
+          <w:noProof/>
+          <w:lang w:eastAsia="pt-BR"/>
+        </w:rPr>
+        <w:t>group by C.cidade;</w:t>
+      </w:r>
+    </w:p>
+    <w:p>
+      <w:pPr>
+        <w:rPr>
+          <w:noProof/>
+          <w:lang w:eastAsia="pt-BR"/>
+        </w:rPr>
+      </w:pPr>
+    </w:p>
+    <w:p>
+      <w:pPr>
+        <w:spacing w:line="278" w:lineRule="auto"/>
+        <w:ind w:firstLine="0"/>
+        <w:jc w:val="left"/>
+        <w:rPr>
+          <w:noProof/>
+          <w:lang w:eastAsia="pt-BR"/>
+        </w:rPr>
+      </w:pPr>
+      <w:r>
+        <w:rPr>
+          <w:noProof/>
+          <w:lang w:eastAsia="pt-BR"/>
+        </w:rPr>
+        <w:br w:type="page"/>
+      </w:r>
+    </w:p>
+    <w:p>
+      <w:pPr>
+        <w:ind w:firstLine="0"/>
+        <w:rPr>
+          <w:b/>
+          <w:bCs/>
+          <w:noProof/>
+          <w:lang w:eastAsia="pt-BR"/>
+        </w:rPr>
+      </w:pPr>
+      <w:r>
+        <w:rPr>
+          <w:b/>
+          <w:bCs/>
+          <w:noProof/>
+          <w:lang w:eastAsia="pt-BR"/>
+        </w:rPr>
+        <w:lastRenderedPageBreak/>
+        <w:t>Utilizando Consultas Aninhadas (Subqueries)</w:t>
+      </w:r>
+    </w:p>
+    <w:p>
+      <w:pPr>
+        <w:rPr>
+          <w:noProof/>
+          <w:lang w:eastAsia="pt-BR"/>
+        </w:rPr>
+      </w:pPr>
+      <w:r>
+        <w:rPr>
+          <w:noProof/>
+          <w:lang w:eastAsia="pt-BR"/>
+        </w:rPr>
+        <w:t>Chamamos de consulta aninhada à consulta cujo o resultado é utilizado por outra consulta, de forma encadeada e contida no mesmo comando SQL.</w:t>
+      </w:r>
+    </w:p>
+    <w:p>
+      <w:pPr>
+        <w:rPr>
+          <w:b/>
+          <w:bCs/>
+          <w:noProof/>
+          <w:lang w:eastAsia="pt-BR"/>
+        </w:rPr>
+      </w:pPr>
+      <w:r>
+        <w:rPr>
+          <w:b/>
+          <w:bCs/>
+          <w:noProof/>
+          <w:lang w:eastAsia="pt-BR"/>
+        </w:rPr>
+        <w:t xml:space="preserve">Questão 9 - </w:t>
+      </w:r>
+      <w:r>
+        <w:rPr>
+          <w:b/>
+          <w:bCs/>
+          <w:noProof/>
+          <w:lang w:eastAsia="pt-BR"/>
+        </w:rPr>
+        <w:t>Problema:</w:t>
+      </w:r>
+    </w:p>
+    <w:p>
+      <w:pPr>
+        <w:rPr>
+          <w:noProof/>
+          <w:lang w:eastAsia="pt-BR"/>
+        </w:rPr>
+      </w:pPr>
+      <w:r>
+        <w:rPr>
+          <w:noProof/>
+          <w:lang w:eastAsia="pt-BR"/>
+        </w:rPr>
+        <w:t>Que produtos estão incluídos em um pedido qualquer com a quantidade pedida igual a 100?</w:t>
+      </w:r>
+    </w:p>
+    <w:p>
+      <w:pPr>
+        <w:rPr>
+          <w:noProof/>
+          <w:lang w:eastAsia="pt-BR"/>
+        </w:rPr>
+      </w:pPr>
+    </w:p>
+    <w:p>
+      <w:pPr>
+        <w:spacing w:line="278" w:lineRule="auto"/>
+        <w:ind w:firstLine="0"/>
+        <w:jc w:val="left"/>
+        <w:rPr>
+          <w:noProof/>
+          <w:lang w:eastAsia="pt-BR"/>
+        </w:rPr>
+      </w:pPr>
+      <w:r>
+        <w:rPr>
+          <w:noProof/>
+          <w:lang w:eastAsia="pt-BR"/>
+        </w:rPr>
+        <w:br w:type="page"/>
+      </w:r>
+    </w:p>
+    <w:p>
+      <w:pPr>
+        <w:rPr>
+          <w:b/>
+          <w:bCs/>
+          <w:noProof/>
+          <w:lang w:eastAsia="pt-BR"/>
+        </w:rPr>
+      </w:pPr>
+      <w:r>
+        <w:rPr>
+          <w:b/>
+          <w:bCs/>
+          <w:noProof/>
+          <w:lang w:eastAsia="pt-BR"/>
+        </w:rPr>
+        <w:lastRenderedPageBreak/>
+        <w:t xml:space="preserve">Questão 10 - </w:t>
+      </w:r>
+      <w:r>
+        <w:rPr>
+          <w:b/>
+          <w:bCs/>
+          <w:noProof/>
+          <w:lang w:eastAsia="pt-BR"/>
+        </w:rPr>
+        <w:t>Problema:</w:t>
+      </w:r>
+    </w:p>
+    <w:p>
+      <w:pPr>
+        <w:rPr>
+          <w:noProof/>
+          <w:lang w:eastAsia="pt-BR"/>
+        </w:rPr>
+      </w:pPr>
+      <w:r>
+        <w:rPr>
+          <w:noProof/>
+          <w:lang w:eastAsia="pt-BR"/>
+        </w:rPr>
+        <w:t>Quais vendedores ganham um salário fixo abaixo da média?</w:t>
+      </w:r>
+    </w:p>
+    <w:p>
+      <w:pPr>
+        <w:rPr>
+          <w:noProof/>
+          <w:lang w:eastAsia="pt-BR"/>
+        </w:rPr>
+      </w:pPr>
+    </w:p>
+    <w:p>
+      <w:pPr>
+        <w:rPr>
+          <w:noProof/>
+          <w:lang w:eastAsia="pt-BR"/>
+        </w:rPr>
+      </w:pPr>
+    </w:p>
+    <w:p>
+      <w:pPr>
+        <w:rPr>
+          <w:noProof/>
+          <w:lang w:eastAsia="pt-BR"/>
+        </w:rPr>
+      </w:pPr>
+    </w:p>
+    <w:p>
+      <w:pPr>
+        <w:spacing w:line="278" w:lineRule="auto"/>
+        <w:ind w:firstLine="0"/>
+        <w:jc w:val="left"/>
+        <w:rPr>
+          <w:noProof/>
+          <w:lang w:eastAsia="pt-BR"/>
+        </w:rPr>
+      </w:pPr>
+      <w:r>
+        <w:rPr>
+          <w:noProof/>
+          <w:lang w:eastAsia="pt-BR"/>
+        </w:rPr>
+        <w:br w:type="page"/>
+      </w:r>
+    </w:p>
+    <w:p>
+      <w:pPr>
+        <w:rPr>
+          <w:b/>
+          <w:bCs/>
+          <w:noProof/>
+          <w:lang w:eastAsia="pt-BR"/>
+        </w:rPr>
+      </w:pPr>
+      <w:r>
+        <w:rPr>
+          <w:b/>
+          <w:bCs/>
+          <w:noProof/>
+          <w:lang w:eastAsia="pt-BR"/>
+        </w:rPr>
+        <w:lastRenderedPageBreak/>
+        <w:t xml:space="preserve">Questão 11 - </w:t>
+      </w:r>
+      <w:r>
+        <w:rPr>
+          <w:b/>
+          <w:bCs/>
+          <w:noProof/>
+          <w:lang w:eastAsia="pt-BR"/>
+        </w:rPr>
+        <w:t>Problema:</w:t>
+      </w:r>
+    </w:p>
+    <w:p>
+      <w:pPr>
+        <w:rPr>
+          <w:noProof/>
+          <w:lang w:eastAsia="pt-BR"/>
+        </w:rPr>
+      </w:pPr>
+      <w:r>
+        <w:rPr>
+          <w:noProof/>
+          <w:lang w:eastAsia="pt-BR"/>
+        </w:rPr>
+        <w:t>Quais os produtos que não estão presentes em nenhum pedido?</w:t>
+      </w:r>
+    </w:p>
+    <w:p>
+      <w:pPr>
+        <w:rPr>
+          <w:noProof/>
+          <w:lang w:eastAsia="pt-BR"/>
+        </w:rPr>
+      </w:pPr>
+    </w:p>
+    <w:p>
+      <w:pPr>
+        <w:rPr>
+          <w:noProof/>
+          <w:lang w:eastAsia="pt-BR"/>
+        </w:rPr>
+      </w:pPr>
+    </w:p>
+    <w:p>
+      <w:pPr>
+        <w:spacing w:line="278" w:lineRule="auto"/>
+        <w:ind w:firstLine="0"/>
+        <w:jc w:val="left"/>
+        <w:rPr>
+          <w:noProof/>
+          <w:lang w:eastAsia="pt-BR"/>
+        </w:rPr>
+      </w:pPr>
+      <w:r>
+        <w:rPr>
+          <w:noProof/>
+          <w:lang w:eastAsia="pt-BR"/>
+        </w:rPr>
+        <w:br w:type="page"/>
+      </w:r>
+    </w:p>
+    <w:p>
+      <w:pPr>
+        <w:ind w:firstLine="0"/>
+        <w:rPr>
+          <w:b/>
+          <w:bCs/>
+          <w:noProof/>
+          <w:lang w:eastAsia="pt-BR"/>
+        </w:rPr>
+      </w:pPr>
+      <w:r>
+        <w:rPr>
+          <w:b/>
+          <w:bCs/>
+          <w:noProof/>
+          <w:lang w:eastAsia="pt-BR"/>
+        </w:rPr>
+        <w:lastRenderedPageBreak/>
+        <w:t>Inserindo Registros Usando um SELECT</w:t>
+      </w:r>
+    </w:p>
+    <w:p>
+      <w:pPr>
+        <w:ind w:firstLine="0"/>
+        <w:rPr>
+          <w:b/>
+          <w:bCs/>
+          <w:noProof/>
+          <w:lang w:eastAsia="pt-BR"/>
+        </w:rPr>
+      </w:pPr>
+    </w:p>
+    <w:p>
+      <w:pPr>
+        <w:rPr>
+          <w:noProof/>
+          <w:lang w:eastAsia="pt-BR"/>
+        </w:rPr>
+      </w:pPr>
+      <w:r>
+        <w:rPr>
+          <w:noProof/>
+          <w:lang w:eastAsia="pt-BR"/>
+        </w:rPr>
+        <w:t>INSERT INTO &lt;nome_tabela&gt; (&lt;lista_de_colunas&gt;)</w:t>
+      </w:r>
+    </w:p>
+    <w:p>
+      <w:pPr>
+        <w:rPr>
+          <w:noProof/>
+          <w:lang w:eastAsia="pt-BR"/>
+        </w:rPr>
+      </w:pPr>
+      <w:r>
+        <w:rPr>
+          <w:noProof/>
+          <w:lang w:eastAsia="pt-BR"/>
+        </w:rPr>
+        <w:t>SELECT &lt;lista_de_colunas&gt;</w:t>
+      </w:r>
+    </w:p>
+    <w:p>
+      <w:pPr>
+        <w:rPr>
+          <w:noProof/>
+          <w:lang w:eastAsia="pt-BR"/>
+        </w:rPr>
+      </w:pPr>
+      <w:r>
+        <w:rPr>
+          <w:noProof/>
+          <w:lang w:eastAsia="pt-BR"/>
+        </w:rPr>
+        <w:t>FROM &lt;nome_tabela&gt;</w:t>
+      </w:r>
+    </w:p>
+    <w:p>
+      <w:pPr>
+        <w:rPr>
+          <w:noProof/>
+          <w:lang w:eastAsia="pt-BR"/>
+        </w:rPr>
+      </w:pPr>
+      <w:r>
+        <w:rPr>
+          <w:noProof/>
+          <w:lang w:eastAsia="pt-BR"/>
+        </w:rPr>
+        <w:t>WHERE &lt;condição_de_seleção&gt;;</w:t>
+      </w:r>
+    </w:p>
+    <w:p>
+      <w:pPr>
+        <w:rPr>
+          <w:noProof/>
+          <w:lang w:eastAsia="pt-BR"/>
+        </w:rPr>
+      </w:pPr>
+    </w:p>
+    <w:p>
+      <w:pPr>
+        <w:rPr>
+          <w:b/>
+          <w:bCs/>
+          <w:noProof/>
+          <w:lang w:eastAsia="pt-BR"/>
+        </w:rPr>
+      </w:pPr>
+      <w:r>
+        <w:rPr>
+          <w:b/>
+          <w:bCs/>
+          <w:noProof/>
+          <w:lang w:eastAsia="pt-BR"/>
+        </w:rPr>
+        <w:t xml:space="preserve">Questão 12 Select e Insert - </w:t>
+      </w:r>
+      <w:r>
+        <w:rPr>
+          <w:b/>
+          <w:bCs/>
+          <w:noProof/>
+          <w:lang w:eastAsia="pt-BR"/>
+        </w:rPr>
+        <w:t>Problema:</w:t>
+      </w:r>
+    </w:p>
+    <w:p>
+      <w:pPr>
+        <w:rPr>
+          <w:noProof/>
+          <w:lang w:eastAsia="pt-BR"/>
+        </w:rPr>
+      </w:pPr>
+      <w:r>
+        <w:rPr>
+          <w:noProof/>
+          <w:lang w:eastAsia="pt-BR"/>
+        </w:rPr>
+        <w:t>Cadastrar como clientes os vendedores que emitiram mais de 3 pedidos. Usar para o código de cliente o mesmo código do vendedor. O restante das colunas devem ser preenchidas com um espaço em branco.</w:t>
+      </w:r>
+    </w:p>
+    <w:p>
+      <w:pPr>
+        <w:rPr>
+          <w:noProof/>
+          <w:lang w:eastAsia="pt-BR"/>
+        </w:rPr>
+      </w:pPr>
+    </w:p>
+    <w:p>
+      <w:pPr>
+        <w:rPr>
+          <w:noProof/>
+          <w:lang w:eastAsia="pt-BR"/>
+        </w:rPr>
+      </w:pPr>
+    </w:p>
+    <w:p>
+      <w:pPr>
+        <w:spacing w:line="278" w:lineRule="auto"/>
+        <w:ind w:firstLine="0"/>
+        <w:jc w:val="left"/>
+        <w:rPr>
+          <w:noProof/>
+          <w:lang w:eastAsia="pt-BR"/>
+        </w:rPr>
+      </w:pPr>
+      <w:r>
+        <w:rPr>
+          <w:noProof/>
+          <w:lang w:eastAsia="pt-BR"/>
+        </w:rPr>
+        <w:br w:type="page"/>
+      </w:r>
+    </w:p>
+    <w:p>
+      <w:pPr>
+        <w:rPr>
+          <w:b/>
+          <w:bCs/>
+          <w:noProof/>
+          <w:lang w:eastAsia="pt-BR"/>
+        </w:rPr>
+      </w:pPr>
+      <w:r>
+        <w:rPr>
+          <w:b/>
+          <w:bCs/>
+          <w:noProof/>
+          <w:lang w:eastAsia="pt-BR"/>
+        </w:rPr>
+        <w:lastRenderedPageBreak/>
+        <w:t xml:space="preserve">Questão 13 Update - </w:t>
+      </w:r>
+      <w:r>
+        <w:rPr>
+          <w:b/>
+          <w:bCs/>
+          <w:noProof/>
+          <w:lang w:eastAsia="pt-BR"/>
+        </w:rPr>
+        <w:t>Problema:</w:t>
+      </w:r>
+    </w:p>
+    <w:p>
+      <w:pPr>
+        <w:rPr>
+          <w:noProof/>
+          <w:lang w:eastAsia="pt-BR"/>
+        </w:rPr>
+      </w:pPr>
+      <w:r>
+        <w:rPr>
+          <w:noProof/>
+          <w:lang w:eastAsia="pt-BR"/>
+        </w:rPr>
+        <w:t>Atualizar o salário fixo de todos os vendedores em 27% mais uma bonificação de R$ 100,00.</w:t>
       </w:r>
     </w:p>
     <w:sectPr>

</xml_diff>

<commit_message>
atividade bd3 - select e views
</commit_message>
<xml_diff>
--- a/3° Módulo/BD III - Banco de Dados/exercicios_SQL/exercicios_SQL_BD3.docx
+++ b/3° Módulo/BD III - Banco de Dados/exercicios_SQL/exercicios_SQL_BD3.docx
@@ -164,6 +164,8 @@
         <w:jc w:val="center"/>
         <w:rPr>
           <w:rFonts w:cs="Arial"/>
+          <w:b/>
+          <w:bCs/>
         </w:rPr>
       </w:pPr>
       <w:r>
@@ -181,11 +183,6 @@
           <w:bCs/>
         </w:rPr>
         <w:br/>
-      </w:r>
-      <w:r>
-        <w:rPr>
-          <w:rFonts w:cs="Arial"/>
-        </w:rPr>
         <w:t>Exercícios</w:t>
       </w:r>
     </w:p>
@@ -309,14 +306,6 @@
     </w:p>
     <w:p>
       <w:pPr>
-        <w:rPr>
-          <w:noProof/>
-          <w:lang w:eastAsia="pt-BR"/>
-        </w:rPr>
-      </w:pPr>
-    </w:p>
-    <w:p>
-      <w:pPr>
         <w:ind w:firstLine="0"/>
         <w:rPr>
           <w:noProof/>
@@ -356,22 +345,39 @@
     </w:p>
     <w:p>
       <w:pPr>
-        <w:ind w:firstLine="0"/>
-        <w:rPr>
-          <w:b/>
-          <w:bCs/>
-          <w:noProof/>
-          <w:lang w:eastAsia="pt-BR"/>
-        </w:rPr>
-      </w:pPr>
-      <w:r>
-        <w:rPr>
-          <w:b/>
-          <w:bCs/>
-          <w:noProof/>
-          <w:lang w:eastAsia="pt-BR"/>
-        </w:rPr>
-        <w:t>Problema:</w:t>
+        <w:rPr>
+          <w:b/>
+          <w:bCs/>
+          <w:noProof/>
+          <w:lang w:eastAsia="pt-BR"/>
+        </w:rPr>
+      </w:pPr>
+      <w:r>
+        <w:rPr>
+          <w:b/>
+          <w:bCs/>
+          <w:noProof/>
+          <w:lang w:eastAsia="pt-BR"/>
+        </w:rPr>
+        <w:t xml:space="preserve">Questão </w:t>
+      </w:r>
+      <w:r>
+        <w:rPr>
+          <w:b/>
+          <w:bCs/>
+          <w:noProof/>
+          <w:lang w:eastAsia="pt-BR"/>
+        </w:rPr>
+        <w:t>01 Join</w:t>
+      </w:r>
+      <w:r>
+        <w:rPr>
+          <w:b/>
+          <w:bCs/>
+          <w:noProof/>
+          <w:lang w:eastAsia="pt-BR"/>
+        </w:rPr>
+        <w:t xml:space="preserve"> - Problema:</w:t>
       </w:r>
     </w:p>
     <w:p>
@@ -434,62 +440,47 @@
           <w:lang w:eastAsia="pt-BR"/>
         </w:rPr>
       </w:pPr>
-    </w:p>
-    <w:p>
-      <w:pPr>
-        <w:rPr>
-          <w:noProof/>
-          <w:lang w:eastAsia="pt-BR"/>
-        </w:rPr>
-      </w:pPr>
-    </w:p>
-    <w:p>
-      <w:pPr>
-        <w:rPr>
-          <w:noProof/>
-          <w:lang w:eastAsia="pt-BR"/>
-        </w:rPr>
-      </w:pPr>
-    </w:p>
-    <w:p>
-      <w:pPr>
-        <w:rPr>
-          <w:noProof/>
-          <w:lang w:eastAsia="pt-BR"/>
-        </w:rPr>
-      </w:pPr>
-    </w:p>
-    <w:p>
-      <w:pPr>
-        <w:rPr>
-          <w:noProof/>
-          <w:lang w:eastAsia="pt-BR"/>
-        </w:rPr>
-      </w:pPr>
-    </w:p>
-    <w:p>
-      <w:pPr>
-        <w:rPr>
-          <w:noProof/>
-          <w:lang w:eastAsia="pt-BR"/>
-        </w:rPr>
-      </w:pPr>
-    </w:p>
-    <w:p>
-      <w:pPr>
-        <w:rPr>
-          <w:noProof/>
-          <w:lang w:eastAsia="pt-BR"/>
-        </w:rPr>
-      </w:pPr>
-    </w:p>
-    <w:p>
-      <w:pPr>
-        <w:rPr>
-          <w:noProof/>
-          <w:lang w:eastAsia="pt-BR"/>
-        </w:rPr>
-      </w:pPr>
+      <w:r>
+        <w:rPr>
+          <w:noProof/>
+          <w:lang w:eastAsia="pt-BR"/>
+        </w:rPr>
+        <w:drawing>
+          <wp:inline distT="0" distB="0" distL="0" distR="0" wp14:anchorId="4C0A4408" wp14:editId="06776971">
+            <wp:extent cx="1628147" cy="3041650"/>
+            <wp:effectExtent l="0" t="0" r="0" b="6350"/>
+            <wp:docPr id="2" name="Imagem 2"/>
+            <wp:cNvGraphicFramePr>
+              <a:graphicFrameLocks xmlns:a="http://schemas.openxmlformats.org/drawingml/2006/main" noChangeAspect="1"/>
+            </wp:cNvGraphicFramePr>
+            <a:graphic xmlns:a="http://schemas.openxmlformats.org/drawingml/2006/main">
+              <a:graphicData uri="http://schemas.openxmlformats.org/drawingml/2006/picture">
+                <pic:pic xmlns:pic="http://schemas.openxmlformats.org/drawingml/2006/picture">
+                  <pic:nvPicPr>
+                    <pic:cNvPr id="1" name=""/>
+                    <pic:cNvPicPr/>
+                  </pic:nvPicPr>
+                  <pic:blipFill>
+                    <a:blip r:embed="rId8"/>
+                    <a:stretch>
+                      <a:fillRect/>
+                    </a:stretch>
+                  </pic:blipFill>
+                  <pic:spPr>
+                    <a:xfrm>
+                      <a:off x="0" y="0"/>
+                      <a:ext cx="1630367" cy="3045797"/>
+                    </a:xfrm>
+                    <a:prstGeom prst="rect">
+                      <a:avLst/>
+                    </a:prstGeom>
+                  </pic:spPr>
+                </pic:pic>
+              </a:graphicData>
+            </a:graphic>
+          </wp:inline>
+        </w:drawing>
+      </w:r>
     </w:p>
     <w:p>
       <w:pPr>
@@ -518,16 +509,56 @@
     <w:p>
       <w:pPr>
         <w:rPr>
-          <w:noProof/>
-          <w:lang w:eastAsia="pt-BR"/>
-        </w:rPr>
-      </w:pPr>
-      <w:r>
-        <w:rPr>
-          <w:noProof/>
-          <w:lang w:eastAsia="pt-BR"/>
-        </w:rPr>
-        <w:t>Problema:</w:t>
+          <w:b/>
+          <w:bCs/>
+          <w:noProof/>
+          <w:lang w:eastAsia="pt-BR"/>
+        </w:rPr>
+      </w:pPr>
+      <w:r>
+        <w:rPr>
+          <w:b/>
+          <w:bCs/>
+          <w:noProof/>
+          <w:lang w:eastAsia="pt-BR"/>
+        </w:rPr>
+        <w:t xml:space="preserve">Questão </w:t>
+      </w:r>
+      <w:r>
+        <w:rPr>
+          <w:b/>
+          <w:bCs/>
+          <w:noProof/>
+          <w:lang w:eastAsia="pt-BR"/>
+        </w:rPr>
+        <w:t>0</w:t>
+      </w:r>
+      <w:r>
+        <w:rPr>
+          <w:b/>
+          <w:bCs/>
+          <w:noProof/>
+          <w:lang w:eastAsia="pt-BR"/>
+        </w:rPr>
+        <w:t>2</w:t>
+      </w:r>
+      <w:r>
+        <w:rPr>
+          <w:b/>
+          <w:bCs/>
+          <w:noProof/>
+          <w:lang w:eastAsia="pt-BR"/>
+        </w:rPr>
+        <w:t xml:space="preserve"> Join</w:t>
+      </w:r>
+      <w:r>
+        <w:rPr>
+          <w:b/>
+          <w:bCs/>
+          <w:noProof/>
+          <w:lang w:eastAsia="pt-BR"/>
+        </w:rPr>
+        <w:t xml:space="preserve"> - Problema:</w:t>
       </w:r>
     </w:p>
     <w:p>
@@ -547,142 +578,158 @@
     </w:p>
     <w:p>
       <w:pPr>
-        <w:rPr>
-          <w:noProof/>
-          <w:lang w:eastAsia="pt-BR"/>
-        </w:rPr>
-      </w:pPr>
-    </w:p>
-    <w:p>
-      <w:pPr>
-        <w:rPr>
-          <w:noProof/>
-          <w:lang w:eastAsia="pt-BR"/>
-        </w:rPr>
-      </w:pPr>
-    </w:p>
-    <w:p>
-      <w:pPr>
-        <w:rPr>
-          <w:noProof/>
-          <w:lang w:eastAsia="pt-BR"/>
-        </w:rPr>
-      </w:pPr>
-    </w:p>
-    <w:p>
-      <w:pPr>
-        <w:rPr>
-          <w:noProof/>
-          <w:lang w:eastAsia="pt-BR"/>
-        </w:rPr>
-      </w:pPr>
-    </w:p>
-    <w:p>
-      <w:pPr>
-        <w:rPr>
-          <w:noProof/>
-          <w:lang w:eastAsia="pt-BR"/>
-        </w:rPr>
-      </w:pPr>
-    </w:p>
-    <w:p>
-      <w:pPr>
-        <w:rPr>
-          <w:noProof/>
-          <w:lang w:eastAsia="pt-BR"/>
-        </w:rPr>
-      </w:pPr>
-    </w:p>
-    <w:p>
-      <w:pPr>
-        <w:rPr>
-          <w:noProof/>
-          <w:lang w:eastAsia="pt-BR"/>
-        </w:rPr>
-      </w:pPr>
-    </w:p>
-    <w:p>
-      <w:pPr>
-        <w:rPr>
-          <w:noProof/>
-          <w:lang w:eastAsia="pt-BR"/>
-        </w:rPr>
-      </w:pPr>
-    </w:p>
-    <w:p>
-      <w:pPr>
-        <w:rPr>
-          <w:noProof/>
-          <w:lang w:eastAsia="pt-BR"/>
-        </w:rPr>
-      </w:pPr>
-    </w:p>
-    <w:p>
-      <w:pPr>
-        <w:rPr>
-          <w:noProof/>
-          <w:lang w:eastAsia="pt-BR"/>
-        </w:rPr>
-      </w:pPr>
-    </w:p>
-    <w:p>
-      <w:pPr>
-        <w:rPr>
-          <w:noProof/>
-          <w:lang w:eastAsia="pt-BR"/>
-        </w:rPr>
-      </w:pPr>
-    </w:p>
-    <w:p>
-      <w:pPr>
-        <w:rPr>
-          <w:noProof/>
-          <w:lang w:eastAsia="pt-BR"/>
-        </w:rPr>
-      </w:pPr>
-    </w:p>
-    <w:p>
-      <w:pPr>
-        <w:rPr>
-          <w:noProof/>
-          <w:lang w:eastAsia="pt-BR"/>
-        </w:rPr>
-      </w:pPr>
-    </w:p>
-    <w:p>
-      <w:pPr>
-        <w:rPr>
-          <w:noProof/>
-          <w:lang w:eastAsia="pt-BR"/>
-        </w:rPr>
-      </w:pPr>
-    </w:p>
-    <w:p>
-      <w:pPr>
-        <w:rPr>
-          <w:noProof/>
-          <w:lang w:eastAsia="pt-BR"/>
-        </w:rPr>
-      </w:pPr>
-    </w:p>
-    <w:p>
-      <w:pPr>
-        <w:rPr>
-          <w:noProof/>
-          <w:lang w:eastAsia="pt-BR"/>
-        </w:rPr>
-      </w:pPr>
-    </w:p>
-    <w:p>
-      <w:pPr>
-        <w:rPr>
-          <w:noProof/>
-          <w:lang w:eastAsia="pt-BR"/>
-        </w:rPr>
-      </w:pPr>
-    </w:p>
-    <w:p>
-      <w:pPr>
+        <w:ind w:left="708" w:firstLine="1"/>
+        <w:rPr>
+          <w:noProof/>
+          <w:lang w:eastAsia="pt-BR"/>
+        </w:rPr>
+      </w:pPr>
+      <w:r>
+        <w:rPr>
+          <w:noProof/>
+          <w:lang w:eastAsia="pt-BR"/>
+        </w:rPr>
+        <w:t xml:space="preserve">Código: </w:t>
+      </w:r>
+      <w:r>
+        <w:rPr>
+          <w:noProof/>
+          <w:lang w:eastAsia="pt-BR"/>
+        </w:rPr>
+        <w:br/>
+      </w:r>
+      <w:hyperlink r:id="rId9" w:tgtFrame="mysql_doc" w:history="1">
+        <w:r>
+          <w:rPr>
+            <w:rStyle w:val="Hyperlink"/>
+            <w:noProof/>
+            <w:lang w:eastAsia="pt-BR"/>
+          </w:rPr>
+          <w:t>SELECT</w:t>
+        </w:r>
+      </w:hyperlink>
+      <w:r>
+        <w:rPr>
+          <w:noProof/>
+          <w:lang w:eastAsia="pt-BR"/>
+        </w:rPr>
+        <w:t xml:space="preserve"> C.nome_cli, P.num_ped </w:t>
+      </w:r>
+    </w:p>
+    <w:p>
+      <w:pPr>
+        <w:rPr>
+          <w:noProof/>
+          <w:lang w:eastAsia="pt-BR"/>
+        </w:rPr>
+      </w:pPr>
+      <w:r>
+        <w:rPr>
+          <w:noProof/>
+          <w:lang w:eastAsia="pt-BR"/>
+        </w:rPr>
+        <w:t xml:space="preserve">FROM cliente C, pedido P </w:t>
+      </w:r>
+    </w:p>
+    <w:p>
+      <w:pPr>
+        <w:rPr>
+          <w:noProof/>
+          <w:lang w:eastAsia="pt-BR"/>
+        </w:rPr>
+      </w:pPr>
+      <w:r>
+        <w:rPr>
+          <w:noProof/>
+          <w:lang w:eastAsia="pt-BR"/>
+        </w:rPr>
+        <w:t xml:space="preserve">WHERE C.cod_cli = P.cd_cli </w:t>
+      </w:r>
+    </w:p>
+    <w:p>
+      <w:pPr>
+        <w:rPr>
+          <w:noProof/>
+          <w:lang w:eastAsia="pt-BR"/>
+        </w:rPr>
+      </w:pPr>
+      <w:r>
+        <w:rPr>
+          <w:noProof/>
+          <w:lang w:eastAsia="pt-BR"/>
+        </w:rPr>
+        <w:t>ORDER BY C.nome_cli;</w:t>
+      </w:r>
+    </w:p>
+    <w:p>
+      <w:pPr>
+        <w:ind w:firstLine="0"/>
+        <w:rPr>
+          <w:noProof/>
+          <w:lang w:eastAsia="pt-BR"/>
+        </w:rPr>
+      </w:pPr>
+      <w:r>
+        <w:rPr>
+          <w:noProof/>
+          <w:lang w:eastAsia="pt-BR"/>
+        </w:rPr>
+        <w:drawing>
+          <wp:inline distT="0" distB="0" distL="0" distR="0" wp14:anchorId="517B429F" wp14:editId="23BC5456">
+            <wp:extent cx="4857750" cy="3330432"/>
+            <wp:effectExtent l="0" t="0" r="0" b="3810"/>
+            <wp:docPr id="1" name="Imagem 1"/>
+            <wp:cNvGraphicFramePr>
+              <a:graphicFrameLocks xmlns:a="http://schemas.openxmlformats.org/drawingml/2006/main" noChangeAspect="1"/>
+            </wp:cNvGraphicFramePr>
+            <a:graphic xmlns:a="http://schemas.openxmlformats.org/drawingml/2006/main">
+              <a:graphicData uri="http://schemas.openxmlformats.org/drawingml/2006/picture">
+                <pic:pic xmlns:pic="http://schemas.openxmlformats.org/drawingml/2006/picture">
+                  <pic:nvPicPr>
+                    <pic:cNvPr id="1" name=""/>
+                    <pic:cNvPicPr/>
+                  </pic:nvPicPr>
+                  <pic:blipFill>
+                    <a:blip r:embed="rId10"/>
+                    <a:stretch>
+                      <a:fillRect/>
+                    </a:stretch>
+                  </pic:blipFill>
+                  <pic:spPr>
+                    <a:xfrm>
+                      <a:off x="0" y="0"/>
+                      <a:ext cx="4867986" cy="3337450"/>
+                    </a:xfrm>
+                    <a:prstGeom prst="rect">
+                      <a:avLst/>
+                    </a:prstGeom>
+                  </pic:spPr>
+                </pic:pic>
+              </a:graphicData>
+            </a:graphic>
+          </wp:inline>
+        </w:drawing>
+      </w:r>
+    </w:p>
+    <w:p>
+      <w:pPr>
+        <w:rPr>
+          <w:noProof/>
+          <w:lang w:eastAsia="pt-BR"/>
+        </w:rPr>
+      </w:pPr>
+    </w:p>
+    <w:p>
+      <w:pPr>
+        <w:rPr>
+          <w:noProof/>
+          <w:lang w:eastAsia="pt-BR"/>
+        </w:rPr>
+      </w:pPr>
+    </w:p>
+    <w:p>
+      <w:pPr>
+        <w:ind w:firstLine="0"/>
         <w:rPr>
           <w:noProof/>
           <w:lang w:eastAsia="pt-BR"/>
@@ -723,16 +770,56 @@
     <w:p>
       <w:pPr>
         <w:rPr>
-          <w:noProof/>
-          <w:lang w:eastAsia="pt-BR"/>
-        </w:rPr>
-      </w:pPr>
-      <w:r>
-        <w:rPr>
-          <w:noProof/>
-          <w:lang w:eastAsia="pt-BR"/>
-        </w:rPr>
-        <w:t>Problema:</w:t>
+          <w:b/>
+          <w:bCs/>
+          <w:noProof/>
+          <w:lang w:eastAsia="pt-BR"/>
+        </w:rPr>
+      </w:pPr>
+      <w:r>
+        <w:rPr>
+          <w:b/>
+          <w:bCs/>
+          <w:noProof/>
+          <w:lang w:eastAsia="pt-BR"/>
+        </w:rPr>
+        <w:t xml:space="preserve">Questão </w:t>
+      </w:r>
+      <w:r>
+        <w:rPr>
+          <w:b/>
+          <w:bCs/>
+          <w:noProof/>
+          <w:lang w:eastAsia="pt-BR"/>
+        </w:rPr>
+        <w:t>0</w:t>
+      </w:r>
+      <w:r>
+        <w:rPr>
+          <w:b/>
+          <w:bCs/>
+          <w:noProof/>
+          <w:lang w:eastAsia="pt-BR"/>
+        </w:rPr>
+        <w:t>3</w:t>
+      </w:r>
+      <w:r>
+        <w:rPr>
+          <w:b/>
+          <w:bCs/>
+          <w:noProof/>
+          <w:lang w:eastAsia="pt-BR"/>
+        </w:rPr>
+        <w:t xml:space="preserve"> Join</w:t>
+      </w:r>
+      <w:r>
+        <w:rPr>
+          <w:b/>
+          <w:bCs/>
+          <w:noProof/>
+          <w:lang w:eastAsia="pt-BR"/>
+        </w:rPr>
+        <w:t xml:space="preserve"> - Problema:</w:t>
       </w:r>
     </w:p>
     <w:p>
@@ -757,38 +844,131 @@
           <w:lang w:eastAsia="pt-BR"/>
         </w:rPr>
       </w:pPr>
-    </w:p>
-    <w:p>
-      <w:pPr>
-        <w:rPr>
-          <w:noProof/>
-          <w:lang w:eastAsia="pt-BR"/>
-        </w:rPr>
-      </w:pPr>
-    </w:p>
-    <w:p>
-      <w:pPr>
-        <w:rPr>
-          <w:noProof/>
-          <w:lang w:eastAsia="pt-BR"/>
-        </w:rPr>
-      </w:pPr>
-    </w:p>
-    <w:p>
-      <w:pPr>
-        <w:rPr>
-          <w:noProof/>
-          <w:lang w:eastAsia="pt-BR"/>
-        </w:rPr>
-      </w:pPr>
-    </w:p>
-    <w:p>
-      <w:pPr>
-        <w:rPr>
-          <w:noProof/>
-          <w:lang w:eastAsia="pt-BR"/>
-        </w:rPr>
-      </w:pPr>
+      <w:r>
+        <w:rPr>
+          <w:noProof/>
+          <w:lang w:eastAsia="pt-BR"/>
+        </w:rPr>
+        <w:t>SELECT C.nome_cli, C.cidade, C.uf, P.num_ped, P.prazo_entr</w:t>
+      </w:r>
+    </w:p>
+    <w:p>
+      <w:pPr>
+        <w:rPr>
+          <w:noProof/>
+          <w:lang w:eastAsia="pt-BR"/>
+        </w:rPr>
+      </w:pPr>
+      <w:r>
+        <w:rPr>
+          <w:noProof/>
+          <w:lang w:eastAsia="pt-BR"/>
+        </w:rPr>
+        <w:t>FROM cliente C, pedido P</w:t>
+      </w:r>
+    </w:p>
+    <w:p>
+      <w:pPr>
+        <w:rPr>
+          <w:noProof/>
+          <w:lang w:eastAsia="pt-BR"/>
+        </w:rPr>
+      </w:pPr>
+      <w:r>
+        <w:rPr>
+          <w:noProof/>
+          <w:lang w:eastAsia="pt-BR"/>
+        </w:rPr>
+        <w:t>WHERE C.cod_cli = P.cd_cli</w:t>
+      </w:r>
+    </w:p>
+    <w:p>
+      <w:pPr>
+        <w:rPr>
+          <w:noProof/>
+          <w:lang w:eastAsia="pt-BR"/>
+        </w:rPr>
+      </w:pPr>
+      <w:r>
+        <w:rPr>
+          <w:noProof/>
+          <w:lang w:eastAsia="pt-BR"/>
+        </w:rPr>
+        <w:t xml:space="preserve">  AND P.prazo_entr &gt; 15</w:t>
+      </w:r>
+    </w:p>
+    <w:p>
+      <w:pPr>
+        <w:rPr>
+          <w:noProof/>
+          <w:lang w:eastAsia="pt-BR"/>
+        </w:rPr>
+      </w:pPr>
+      <w:r>
+        <w:rPr>
+          <w:noProof/>
+          <w:lang w:eastAsia="pt-BR"/>
+        </w:rPr>
+        <w:t xml:space="preserve">  AND C.uf IN ('sp', 'rj');</w:t>
+      </w:r>
+    </w:p>
+    <w:p>
+      <w:pPr>
+        <w:rPr>
+          <w:noProof/>
+          <w:lang w:eastAsia="pt-BR"/>
+        </w:rPr>
+      </w:pPr>
+    </w:p>
+    <w:p>
+      <w:pPr>
+        <w:ind w:firstLine="0"/>
+        <w:rPr>
+          <w:noProof/>
+          <w:lang w:eastAsia="pt-BR"/>
+        </w:rPr>
+      </w:pPr>
+      <w:r>
+        <w:rPr>
+          <w:noProof/>
+          <w:lang w:eastAsia="pt-BR"/>
+        </w:rPr>
+        <w:drawing>
+          <wp:inline distT="0" distB="0" distL="0" distR="0" wp14:anchorId="3EEA01D9" wp14:editId="5D3B1BC8">
+            <wp:extent cx="5760085" cy="1223010"/>
+            <wp:effectExtent l="0" t="0" r="0" b="0"/>
+            <wp:docPr id="3" name="Imagem 3"/>
+            <wp:cNvGraphicFramePr>
+              <a:graphicFrameLocks xmlns:a="http://schemas.openxmlformats.org/drawingml/2006/main" noChangeAspect="1"/>
+            </wp:cNvGraphicFramePr>
+            <a:graphic xmlns:a="http://schemas.openxmlformats.org/drawingml/2006/main">
+              <a:graphicData uri="http://schemas.openxmlformats.org/drawingml/2006/picture">
+                <pic:pic xmlns:pic="http://schemas.openxmlformats.org/drawingml/2006/picture">
+                  <pic:nvPicPr>
+                    <pic:cNvPr id="1" name=""/>
+                    <pic:cNvPicPr/>
+                  </pic:nvPicPr>
+                  <pic:blipFill>
+                    <a:blip r:embed="rId11"/>
+                    <a:stretch>
+                      <a:fillRect/>
+                    </a:stretch>
+                  </pic:blipFill>
+                  <pic:spPr>
+                    <a:xfrm>
+                      <a:off x="0" y="0"/>
+                      <a:ext cx="5760085" cy="1223010"/>
+                    </a:xfrm>
+                    <a:prstGeom prst="rect">
+                      <a:avLst/>
+                    </a:prstGeom>
+                  </pic:spPr>
+                </pic:pic>
+              </a:graphicData>
+            </a:graphic>
+          </wp:inline>
+        </w:drawing>
+      </w:r>
     </w:p>
     <w:p>
       <w:pPr>
@@ -800,72 +980,6 @@
           <w:lang w:eastAsia="pt-BR"/>
         </w:rPr>
       </w:pPr>
-      <w:r>
-        <w:rPr>
-          <w:noProof/>
-          <w:lang w:eastAsia="pt-BR"/>
-        </w:rPr>
-        <w:br w:type="page"/>
-      </w:r>
-    </w:p>
-    <w:p>
-      <w:pPr>
-        <w:rPr>
-          <w:b/>
-          <w:bCs/>
-          <w:noProof/>
-          <w:lang w:eastAsia="pt-BR"/>
-        </w:rPr>
-      </w:pPr>
-      <w:r>
-        <w:rPr>
-          <w:b/>
-          <w:bCs/>
-          <w:noProof/>
-          <w:lang w:eastAsia="pt-BR"/>
-        </w:rPr>
-        <w:lastRenderedPageBreak/>
-        <w:t>Problema:</w:t>
-      </w:r>
-    </w:p>
-    <w:p>
-      <w:pPr>
-        <w:rPr>
-          <w:noProof/>
-          <w:lang w:eastAsia="pt-BR"/>
-        </w:rPr>
-      </w:pPr>
-      <w:r>
-        <w:rPr>
-          <w:noProof/>
-          <w:lang w:eastAsia="pt-BR"/>
-        </w:rPr>
-        <w:t>Mostrar os pedidos dos clientes e seus respectivos prazos de entrega, ordenados do maior para o menor.</w:t>
-      </w:r>
-    </w:p>
-    <w:p>
-      <w:pPr>
-        <w:rPr>
-          <w:noProof/>
-          <w:lang w:eastAsia="pt-BR"/>
-        </w:rPr>
-      </w:pPr>
-    </w:p>
-    <w:p>
-      <w:pPr>
-        <w:rPr>
-          <w:noProof/>
-          <w:lang w:eastAsia="pt-BR"/>
-        </w:rPr>
-      </w:pPr>
-    </w:p>
-    <w:p>
-      <w:pPr>
-        <w:rPr>
-          <w:noProof/>
-          <w:lang w:eastAsia="pt-BR"/>
-        </w:rPr>
-      </w:pPr>
     </w:p>
     <w:p>
       <w:pPr>
@@ -873,12 +987,16 @@
         <w:ind w:firstLine="0"/>
         <w:jc w:val="left"/>
         <w:rPr>
-          <w:noProof/>
-          <w:lang w:eastAsia="pt-BR"/>
-        </w:rPr>
-      </w:pPr>
-      <w:r>
-        <w:rPr>
+          <w:b/>
+          <w:bCs/>
+          <w:noProof/>
+          <w:lang w:eastAsia="pt-BR"/>
+        </w:rPr>
+      </w:pPr>
+      <w:r>
+        <w:rPr>
+          <w:b/>
+          <w:bCs/>
           <w:noProof/>
           <w:lang w:eastAsia="pt-BR"/>
         </w:rPr>
@@ -902,131 +1020,168 @@
           <w:lang w:eastAsia="pt-BR"/>
         </w:rPr>
         <w:lastRenderedPageBreak/>
-        <w:t>Sinônimos</w:t>
-      </w:r>
-    </w:p>
-    <w:p>
-      <w:pPr>
-        <w:rPr>
-          <w:noProof/>
-          <w:lang w:eastAsia="pt-BR"/>
-        </w:rPr>
-      </w:pPr>
-      <w:r>
-        <w:rPr>
-          <w:noProof/>
-          <w:lang w:eastAsia="pt-BR"/>
-        </w:rPr>
-        <w:t>Para que não seja necessário escrever o nome da tabela nas qualificações de nomes, podemos utilizar ALIASES definidos na própria consulta.</w:t>
-      </w:r>
-    </w:p>
-    <w:p>
-      <w:pPr>
-        <w:rPr>
-          <w:noProof/>
-          <w:lang w:eastAsia="pt-BR"/>
-        </w:rPr>
-      </w:pPr>
-      <w:r>
-        <w:rPr>
-          <w:noProof/>
-          <w:lang w:eastAsia="pt-BR"/>
-        </w:rPr>
-        <w:t>A definição dos ALIASES é feita na cláusula FROM, sendo então utilizada nas outras cláusulas (WHERE, ORDER BY, GROUP BY, HAVING e SELECT) de uma consulta.</w:t>
-      </w:r>
-    </w:p>
-    <w:p>
-      <w:pPr>
-        <w:rPr>
-          <w:b/>
-          <w:bCs/>
-          <w:noProof/>
-          <w:lang w:eastAsia="pt-BR"/>
-        </w:rPr>
-      </w:pPr>
-      <w:r>
-        <w:rPr>
-          <w:b/>
-          <w:bCs/>
-          <w:noProof/>
-          <w:lang w:eastAsia="pt-BR"/>
-        </w:rPr>
-        <w:t>Problema:</w:t>
-      </w:r>
-    </w:p>
-    <w:p>
-      <w:pPr>
-        <w:rPr>
-          <w:noProof/>
-          <w:lang w:eastAsia="pt-BR"/>
-        </w:rPr>
-      </w:pPr>
-      <w:r>
-        <w:rPr>
-          <w:noProof/>
-          <w:lang w:eastAsia="pt-BR"/>
-        </w:rPr>
-        <w:t>Exibir os vendedores (ordenados por nome) que emitiram pedidos com prazos de entrega superiores a 15 dias e que tenham salários fixos iguais ou superiores a R$ 1.000,00.</w:t>
-      </w:r>
-    </w:p>
-    <w:p>
-      <w:pPr>
-        <w:rPr>
-          <w:noProof/>
-          <w:lang w:eastAsia="pt-BR"/>
-        </w:rPr>
-      </w:pPr>
-      <w:r>
-        <w:rPr>
-          <w:noProof/>
-          <w:lang w:eastAsia="pt-BR"/>
-        </w:rPr>
-        <w:t>select distinct nome_vend, prazo_entr</w:t>
-      </w:r>
-    </w:p>
-    <w:p>
-      <w:pPr>
-        <w:rPr>
-          <w:noProof/>
-          <w:lang w:eastAsia="pt-BR"/>
-        </w:rPr>
-      </w:pPr>
-      <w:r>
-        <w:rPr>
-          <w:noProof/>
-          <w:lang w:eastAsia="pt-BR"/>
-        </w:rPr>
-        <w:t>from vendedor V, pedido P</w:t>
-      </w:r>
-    </w:p>
-    <w:p>
-      <w:pPr>
-        <w:rPr>
-          <w:noProof/>
-          <w:lang w:eastAsia="pt-BR"/>
-        </w:rPr>
-      </w:pPr>
-      <w:r>
-        <w:rPr>
-          <w:noProof/>
-          <w:lang w:eastAsia="pt-BR"/>
-        </w:rPr>
-        <w:t>where V.cod_vend=P.cd_vend and V.sal_fixo&gt;1000 and prazo_entr&gt;15</w:t>
-      </w:r>
-    </w:p>
-    <w:p>
-      <w:pPr>
-        <w:rPr>
-          <w:noProof/>
-          <w:lang w:eastAsia="pt-BR"/>
-        </w:rPr>
-      </w:pPr>
-      <w:r>
-        <w:rPr>
-          <w:noProof/>
-          <w:lang w:eastAsia="pt-BR"/>
-        </w:rPr>
-        <w:t>order by nome_vend;</w:t>
+        <w:t xml:space="preserve">Questão </w:t>
+      </w:r>
+      <w:r>
+        <w:rPr>
+          <w:b/>
+          <w:bCs/>
+          <w:noProof/>
+          <w:lang w:eastAsia="pt-BR"/>
+        </w:rPr>
+        <w:t>0</w:t>
+      </w:r>
+      <w:r>
+        <w:rPr>
+          <w:b/>
+          <w:bCs/>
+          <w:noProof/>
+          <w:lang w:eastAsia="pt-BR"/>
+        </w:rPr>
+        <w:t>4</w:t>
+      </w:r>
+      <w:r>
+        <w:rPr>
+          <w:b/>
+          <w:bCs/>
+          <w:noProof/>
+          <w:lang w:eastAsia="pt-BR"/>
+        </w:rPr>
+        <w:t xml:space="preserve"> Join</w:t>
+      </w:r>
+      <w:r>
+        <w:rPr>
+          <w:b/>
+          <w:bCs/>
+          <w:noProof/>
+          <w:lang w:eastAsia="pt-BR"/>
+        </w:rPr>
+        <w:t xml:space="preserve"> - Problema:</w:t>
+      </w:r>
+    </w:p>
+    <w:p>
+      <w:pPr>
+        <w:rPr>
+          <w:noProof/>
+          <w:lang w:eastAsia="pt-BR"/>
+        </w:rPr>
+      </w:pPr>
+      <w:r>
+        <w:rPr>
+          <w:noProof/>
+          <w:lang w:eastAsia="pt-BR"/>
+        </w:rPr>
+        <w:t>Mostrar os pedidos dos clientes e seus respectivos prazos de entrega, ordenados do maior para o menor.</w:t>
+      </w:r>
+    </w:p>
+    <w:p>
+      <w:pPr>
+        <w:rPr>
+          <w:noProof/>
+          <w:lang w:eastAsia="pt-BR"/>
+        </w:rPr>
+      </w:pPr>
+      <w:r>
+        <w:rPr>
+          <w:noProof/>
+          <w:lang w:eastAsia="pt-BR"/>
+        </w:rPr>
+        <w:t>SELECT C.nome_cli, P.num_ped, P.prazo_entr</w:t>
+      </w:r>
+    </w:p>
+    <w:p>
+      <w:pPr>
+        <w:rPr>
+          <w:noProof/>
+          <w:lang w:eastAsia="pt-BR"/>
+        </w:rPr>
+      </w:pPr>
+      <w:r>
+        <w:rPr>
+          <w:noProof/>
+          <w:lang w:eastAsia="pt-BR"/>
+        </w:rPr>
+        <w:t>FROM cliente C, pedido P</w:t>
+      </w:r>
+    </w:p>
+    <w:p>
+      <w:pPr>
+        <w:rPr>
+          <w:noProof/>
+          <w:lang w:eastAsia="pt-BR"/>
+        </w:rPr>
+      </w:pPr>
+      <w:r>
+        <w:rPr>
+          <w:noProof/>
+          <w:lang w:eastAsia="pt-BR"/>
+        </w:rPr>
+        <w:t>WHERE C.cod_cli = P.cd_cli</w:t>
+      </w:r>
+    </w:p>
+    <w:p>
+      <w:pPr>
+        <w:rPr>
+          <w:noProof/>
+          <w:lang w:eastAsia="pt-BR"/>
+        </w:rPr>
+      </w:pPr>
+      <w:r>
+        <w:rPr>
+          <w:noProof/>
+          <w:lang w:eastAsia="pt-BR"/>
+        </w:rPr>
+        <w:t>ORDER BY P.prazo_entr DESC;</w:t>
+      </w:r>
+    </w:p>
+    <w:p>
+      <w:pPr>
+        <w:ind w:firstLine="0"/>
+        <w:rPr>
+          <w:noProof/>
+          <w:lang w:eastAsia="pt-BR"/>
+        </w:rPr>
+      </w:pPr>
+      <w:r>
+        <w:rPr>
+          <w:noProof/>
+          <w:lang w:eastAsia="pt-BR"/>
+        </w:rPr>
+        <w:drawing>
+          <wp:inline distT="0" distB="0" distL="0" distR="0" wp14:anchorId="51E8E239" wp14:editId="01903E13">
+            <wp:extent cx="5760085" cy="3281680"/>
+            <wp:effectExtent l="0" t="0" r="0" b="0"/>
+            <wp:docPr id="4" name="Imagem 4"/>
+            <wp:cNvGraphicFramePr>
+              <a:graphicFrameLocks xmlns:a="http://schemas.openxmlformats.org/drawingml/2006/main" noChangeAspect="1"/>
+            </wp:cNvGraphicFramePr>
+            <a:graphic xmlns:a="http://schemas.openxmlformats.org/drawingml/2006/main">
+              <a:graphicData uri="http://schemas.openxmlformats.org/drawingml/2006/picture">
+                <pic:pic xmlns:pic="http://schemas.openxmlformats.org/drawingml/2006/picture">
+                  <pic:nvPicPr>
+                    <pic:cNvPr id="1" name=""/>
+                    <pic:cNvPicPr/>
+                  </pic:nvPicPr>
+                  <pic:blipFill>
+                    <a:blip r:embed="rId12"/>
+                    <a:stretch>
+                      <a:fillRect/>
+                    </a:stretch>
+                  </pic:blipFill>
+                  <pic:spPr>
+                    <a:xfrm>
+                      <a:off x="0" y="0"/>
+                      <a:ext cx="5760085" cy="3281680"/>
+                    </a:xfrm>
+                    <a:prstGeom prst="rect">
+                      <a:avLst/>
+                    </a:prstGeom>
+                  </pic:spPr>
+                </pic:pic>
+              </a:graphicData>
+            </a:graphic>
+          </wp:inline>
+        </w:drawing>
       </w:r>
     </w:p>
     <w:p>
@@ -1074,52 +1229,240 @@
     <w:p>
       <w:pPr>
         <w:rPr>
-          <w:noProof/>
-          <w:lang w:eastAsia="pt-BR"/>
-        </w:rPr>
-      </w:pPr>
-      <w:r>
-        <w:rPr>
+          <w:b/>
+          <w:bCs/>
+          <w:noProof/>
+          <w:lang w:eastAsia="pt-BR"/>
+        </w:rPr>
+      </w:pPr>
+      <w:r>
+        <w:rPr>
+          <w:b/>
+          <w:bCs/>
           <w:noProof/>
           <w:lang w:eastAsia="pt-BR"/>
         </w:rPr>
         <w:lastRenderedPageBreak/>
-        <w:t>Junções Envolvendo Três ou mais Tabelas</w:t>
-      </w:r>
-    </w:p>
-    <w:p>
-      <w:pPr>
-        <w:rPr>
-          <w:b/>
-          <w:bCs/>
-          <w:noProof/>
-          <w:lang w:eastAsia="pt-BR"/>
-        </w:rPr>
-      </w:pPr>
-      <w:r>
-        <w:rPr>
-          <w:b/>
-          <w:bCs/>
-          <w:noProof/>
-          <w:lang w:eastAsia="pt-BR"/>
-        </w:rPr>
-        <w:t>Problema:</w:t>
-      </w:r>
-    </w:p>
-    <w:p>
-      <w:pPr>
-        <w:rPr>
-          <w:noProof/>
-          <w:lang w:eastAsia="pt-BR"/>
-        </w:rPr>
-      </w:pPr>
-      <w:r>
-        <w:rPr>
-          <w:noProof/>
-          <w:lang w:eastAsia="pt-BR"/>
-        </w:rPr>
-        <w:t>Exiba a relação dos clientes localizados no Rio de Janeiro (ordenados alfabeticamente) que têm pedidos do produto Chapa de Aco com prazos de entrega superirores a 15 dias.</w:t>
-      </w:r>
+        <w:t>Sinônimos</w:t>
+      </w:r>
+    </w:p>
+    <w:p>
+      <w:pPr>
+        <w:rPr>
+          <w:noProof/>
+          <w:lang w:eastAsia="pt-BR"/>
+        </w:rPr>
+      </w:pPr>
+      <w:r>
+        <w:rPr>
+          <w:noProof/>
+          <w:lang w:eastAsia="pt-BR"/>
+        </w:rPr>
+        <w:t>Para que não seja necessário escrever o nome da tabela nas qualificações de nomes, podemos utilizar ALIASES definidos na própria consulta.</w:t>
+      </w:r>
+    </w:p>
+    <w:p>
+      <w:pPr>
+        <w:rPr>
+          <w:noProof/>
+          <w:lang w:eastAsia="pt-BR"/>
+        </w:rPr>
+      </w:pPr>
+      <w:r>
+        <w:rPr>
+          <w:noProof/>
+          <w:lang w:eastAsia="pt-BR"/>
+        </w:rPr>
+        <w:t>A definição dos ALIASES é feita na cláusula FROM, sendo então utilizada nas outras cláusulas (WHERE, ORDER BY, GROUP BY, HAVING e SELECT) de uma consulta.</w:t>
+      </w:r>
+    </w:p>
+    <w:p>
+      <w:pPr>
+        <w:rPr>
+          <w:b/>
+          <w:bCs/>
+          <w:noProof/>
+          <w:lang w:eastAsia="pt-BR"/>
+        </w:rPr>
+      </w:pPr>
+      <w:r>
+        <w:rPr>
+          <w:b/>
+          <w:bCs/>
+          <w:noProof/>
+          <w:lang w:eastAsia="pt-BR"/>
+        </w:rPr>
+        <w:t xml:space="preserve">Questão </w:t>
+      </w:r>
+      <w:r>
+        <w:rPr>
+          <w:b/>
+          <w:bCs/>
+          <w:noProof/>
+          <w:lang w:eastAsia="pt-BR"/>
+        </w:rPr>
+        <w:t>0</w:t>
+      </w:r>
+      <w:r>
+        <w:rPr>
+          <w:b/>
+          <w:bCs/>
+          <w:noProof/>
+          <w:lang w:eastAsia="pt-BR"/>
+        </w:rPr>
+        <w:t>5</w:t>
+      </w:r>
+      <w:r>
+        <w:rPr>
+          <w:b/>
+          <w:bCs/>
+          <w:noProof/>
+          <w:lang w:eastAsia="pt-BR"/>
+        </w:rPr>
+        <w:t xml:space="preserve"> Join</w:t>
+      </w:r>
+      <w:r>
+        <w:rPr>
+          <w:b/>
+          <w:bCs/>
+          <w:noProof/>
+          <w:lang w:eastAsia="pt-BR"/>
+        </w:rPr>
+        <w:t xml:space="preserve"> - Problema:</w:t>
+      </w:r>
+    </w:p>
+    <w:p>
+      <w:pPr>
+        <w:rPr>
+          <w:noProof/>
+          <w:lang w:eastAsia="pt-BR"/>
+        </w:rPr>
+      </w:pPr>
+      <w:r>
+        <w:rPr>
+          <w:noProof/>
+          <w:lang w:eastAsia="pt-BR"/>
+        </w:rPr>
+        <w:t>Exibir os vendedores (ordenados por nome) que emitiram pedidos com prazos de entrega superiores a 15 dias e que tenham salários fixos iguais ou superiores a R$ 1.000,00.</w:t>
+      </w:r>
+    </w:p>
+    <w:p>
+      <w:pPr>
+        <w:rPr>
+          <w:noProof/>
+          <w:lang w:eastAsia="pt-BR"/>
+        </w:rPr>
+      </w:pPr>
+      <w:r>
+        <w:rPr>
+          <w:noProof/>
+          <w:lang w:eastAsia="pt-BR"/>
+        </w:rPr>
+        <w:t>select distinct nome_vend, prazo_entr</w:t>
+      </w:r>
+    </w:p>
+    <w:p>
+      <w:pPr>
+        <w:rPr>
+          <w:noProof/>
+          <w:lang w:eastAsia="pt-BR"/>
+        </w:rPr>
+      </w:pPr>
+      <w:r>
+        <w:rPr>
+          <w:noProof/>
+          <w:lang w:eastAsia="pt-BR"/>
+        </w:rPr>
+        <w:t>from vendedor V, pedido P</w:t>
+      </w:r>
+    </w:p>
+    <w:p>
+      <w:pPr>
+        <w:rPr>
+          <w:noProof/>
+          <w:lang w:eastAsia="pt-BR"/>
+        </w:rPr>
+      </w:pPr>
+      <w:r>
+        <w:rPr>
+          <w:noProof/>
+          <w:lang w:eastAsia="pt-BR"/>
+        </w:rPr>
+        <w:t>where V.cod_vend=P.cd_vend and V.sal_fixo&gt;1000 and prazo_entr&gt;15</w:t>
+      </w:r>
+    </w:p>
+    <w:p>
+      <w:pPr>
+        <w:rPr>
+          <w:noProof/>
+          <w:lang w:eastAsia="pt-BR"/>
+        </w:rPr>
+      </w:pPr>
+      <w:r>
+        <w:rPr>
+          <w:noProof/>
+          <w:lang w:eastAsia="pt-BR"/>
+        </w:rPr>
+        <w:t>order by nome_vend;</w:t>
+      </w:r>
+    </w:p>
+    <w:p>
+      <w:pPr>
+        <w:ind w:firstLine="0"/>
+        <w:rPr>
+          <w:noProof/>
+          <w:lang w:eastAsia="pt-BR"/>
+        </w:rPr>
+      </w:pPr>
+      <w:r>
+        <w:rPr>
+          <w:noProof/>
+          <w:lang w:eastAsia="pt-BR"/>
+        </w:rPr>
+        <w:drawing>
+          <wp:inline distT="0" distB="0" distL="0" distR="0" wp14:anchorId="37940A88" wp14:editId="42669D51">
+            <wp:extent cx="5760085" cy="2009775"/>
+            <wp:effectExtent l="0" t="0" r="0" b="9525"/>
+            <wp:docPr id="5" name="Imagem 5"/>
+            <wp:cNvGraphicFramePr>
+              <a:graphicFrameLocks xmlns:a="http://schemas.openxmlformats.org/drawingml/2006/main" noChangeAspect="1"/>
+            </wp:cNvGraphicFramePr>
+            <a:graphic xmlns:a="http://schemas.openxmlformats.org/drawingml/2006/main">
+              <a:graphicData uri="http://schemas.openxmlformats.org/drawingml/2006/picture">
+                <pic:pic xmlns:pic="http://schemas.openxmlformats.org/drawingml/2006/picture">
+                  <pic:nvPicPr>
+                    <pic:cNvPr id="1" name=""/>
+                    <pic:cNvPicPr/>
+                  </pic:nvPicPr>
+                  <pic:blipFill>
+                    <a:blip r:embed="rId13"/>
+                    <a:stretch>
+                      <a:fillRect/>
+                    </a:stretch>
+                  </pic:blipFill>
+                  <pic:spPr>
+                    <a:xfrm>
+                      <a:off x="0" y="0"/>
+                      <a:ext cx="5760085" cy="2009775"/>
+                    </a:xfrm>
+                    <a:prstGeom prst="rect">
+                      <a:avLst/>
+                    </a:prstGeom>
+                  </pic:spPr>
+                </pic:pic>
+              </a:graphicData>
+            </a:graphic>
+          </wp:inline>
+        </w:drawing>
+      </w:r>
+    </w:p>
+    <w:p>
+      <w:pPr>
+        <w:rPr>
+          <w:noProof/>
+          <w:lang w:eastAsia="pt-BR"/>
+        </w:rPr>
+      </w:pPr>
     </w:p>
     <w:p>
       <w:pPr>
@@ -1168,30 +1511,330 @@
           <w:lang w:eastAsia="pt-BR"/>
         </w:rPr>
         <w:lastRenderedPageBreak/>
-        <w:t xml:space="preserve">Questão 7 - </w:t>
-      </w:r>
-      <w:r>
-        <w:rPr>
-          <w:noProof/>
-          <w:lang w:eastAsia="pt-BR"/>
-        </w:rPr>
-        <w:t>Problema:</w:t>
-      </w:r>
-    </w:p>
-    <w:p>
-      <w:pPr>
-        <w:rPr>
-          <w:noProof/>
-          <w:lang w:eastAsia="pt-BR"/>
-        </w:rPr>
-      </w:pPr>
-      <w:r>
-        <w:rPr>
-          <w:noProof/>
-          <w:lang w:eastAsia="pt-BR"/>
-        </w:rPr>
-        <w:t>Mostre os nome de todos os vendedores que venderam Chapa de Aco em quantidade superior a 300 Kg.</w:t>
-      </w:r>
+        <w:t>Junções Envolvendo Três ou mais Tabelas</w:t>
+      </w:r>
+    </w:p>
+    <w:p>
+      <w:pPr>
+        <w:rPr>
+          <w:b/>
+          <w:bCs/>
+          <w:noProof/>
+          <w:lang w:eastAsia="pt-BR"/>
+        </w:rPr>
+      </w:pPr>
+      <w:r>
+        <w:rPr>
+          <w:b/>
+          <w:bCs/>
+          <w:noProof/>
+          <w:lang w:eastAsia="pt-BR"/>
+        </w:rPr>
+        <w:t xml:space="preserve">Questão </w:t>
+      </w:r>
+      <w:r>
+        <w:rPr>
+          <w:b/>
+          <w:bCs/>
+          <w:noProof/>
+          <w:lang w:eastAsia="pt-BR"/>
+        </w:rPr>
+        <w:t>0</w:t>
+      </w:r>
+      <w:r>
+        <w:rPr>
+          <w:b/>
+          <w:bCs/>
+          <w:noProof/>
+          <w:lang w:eastAsia="pt-BR"/>
+        </w:rPr>
+        <w:t>6</w:t>
+      </w:r>
+      <w:r>
+        <w:rPr>
+          <w:b/>
+          <w:bCs/>
+          <w:noProof/>
+          <w:lang w:eastAsia="pt-BR"/>
+        </w:rPr>
+        <w:t xml:space="preserve"> Join</w:t>
+      </w:r>
+      <w:r>
+        <w:rPr>
+          <w:b/>
+          <w:bCs/>
+          <w:noProof/>
+          <w:lang w:eastAsia="pt-BR"/>
+        </w:rPr>
+        <w:t xml:space="preserve"> - Problema:</w:t>
+      </w:r>
+    </w:p>
+    <w:p>
+      <w:pPr>
+        <w:rPr>
+          <w:noProof/>
+          <w:lang w:eastAsia="pt-BR"/>
+        </w:rPr>
+      </w:pPr>
+      <w:r>
+        <w:rPr>
+          <w:noProof/>
+          <w:lang w:eastAsia="pt-BR"/>
+        </w:rPr>
+        <w:t>Exiba a relação dos clientes localizados no Rio de Janeiro (ordenados alfabeticamente) que têm pedidos do produto Chapa de Aco com prazos de entrega superirores a 15 dias.</w:t>
+      </w:r>
+    </w:p>
+    <w:p>
+      <w:pPr>
+        <w:rPr>
+          <w:noProof/>
+          <w:lang w:eastAsia="pt-BR"/>
+        </w:rPr>
+      </w:pPr>
+      <w:hyperlink r:id="rId14" w:tgtFrame="mysql_doc" w:history="1">
+        <w:r>
+          <w:rPr>
+            <w:rStyle w:val="Hyperlink"/>
+            <w:noProof/>
+            <w:lang w:eastAsia="pt-BR"/>
+          </w:rPr>
+          <w:t>SELECT</w:t>
+        </w:r>
+      </w:hyperlink>
+      <w:r>
+        <w:rPr>
+          <w:noProof/>
+          <w:lang w:eastAsia="pt-BR"/>
+        </w:rPr>
+        <w:t xml:space="preserve"> DISTINCT C.nome_cli </w:t>
+      </w:r>
+    </w:p>
+    <w:p>
+      <w:pPr>
+        <w:rPr>
+          <w:noProof/>
+          <w:lang w:eastAsia="pt-BR"/>
+        </w:rPr>
+      </w:pPr>
+      <w:r>
+        <w:rPr>
+          <w:noProof/>
+          <w:lang w:eastAsia="pt-BR"/>
+        </w:rPr>
+        <w:t xml:space="preserve">FROM cliente C, pedido P, item_pedido I, produto PR </w:t>
+      </w:r>
+    </w:p>
+    <w:p>
+      <w:pPr>
+        <w:rPr>
+          <w:noProof/>
+          <w:lang w:eastAsia="pt-BR"/>
+        </w:rPr>
+      </w:pPr>
+      <w:r>
+        <w:rPr>
+          <w:noProof/>
+          <w:lang w:eastAsia="pt-BR"/>
+        </w:rPr>
+        <w:t xml:space="preserve">WHERE C.cod_cli = P.cd_cli </w:t>
+      </w:r>
+    </w:p>
+    <w:p>
+      <w:pPr>
+        <w:rPr>
+          <w:noProof/>
+          <w:lang w:eastAsia="pt-BR"/>
+        </w:rPr>
+      </w:pPr>
+      <w:hyperlink r:id="rId15" w:tgtFrame="mysql_doc" w:history="1">
+        <w:r>
+          <w:rPr>
+            <w:rStyle w:val="Hyperlink"/>
+            <w:noProof/>
+            <w:lang w:eastAsia="pt-BR"/>
+          </w:rPr>
+          <w:t>AND</w:t>
+        </w:r>
+      </w:hyperlink>
+      <w:r>
+        <w:rPr>
+          <w:noProof/>
+          <w:lang w:eastAsia="pt-BR"/>
+        </w:rPr>
+        <w:t xml:space="preserve"> P.num_ped = I.no_ped</w:t>
+      </w:r>
+    </w:p>
+    <w:p>
+      <w:pPr>
+        <w:rPr>
+          <w:noProof/>
+          <w:lang w:eastAsia="pt-BR"/>
+        </w:rPr>
+      </w:pPr>
+      <w:r>
+        <w:rPr>
+          <w:noProof/>
+          <w:lang w:eastAsia="pt-BR"/>
+        </w:rPr>
+        <w:t xml:space="preserve"> </w:t>
+      </w:r>
+      <w:hyperlink r:id="rId16" w:tgtFrame="mysql_doc" w:history="1">
+        <w:r>
+          <w:rPr>
+            <w:rStyle w:val="Hyperlink"/>
+            <w:noProof/>
+            <w:lang w:eastAsia="pt-BR"/>
+          </w:rPr>
+          <w:t>AND</w:t>
+        </w:r>
+      </w:hyperlink>
+      <w:r>
+        <w:rPr>
+          <w:noProof/>
+          <w:lang w:eastAsia="pt-BR"/>
+        </w:rPr>
+        <w:t xml:space="preserve"> I.cd_prod = PR.cod_prod </w:t>
+      </w:r>
+    </w:p>
+    <w:p>
+      <w:pPr>
+        <w:rPr>
+          <w:noProof/>
+          <w:lang w:eastAsia="pt-BR"/>
+        </w:rPr>
+      </w:pPr>
+      <w:hyperlink r:id="rId17" w:tgtFrame="mysql_doc" w:history="1">
+        <w:r>
+          <w:rPr>
+            <w:rStyle w:val="Hyperlink"/>
+            <w:noProof/>
+            <w:lang w:eastAsia="pt-BR"/>
+          </w:rPr>
+          <w:t>AND</w:t>
+        </w:r>
+      </w:hyperlink>
+      <w:r>
+        <w:rPr>
+          <w:noProof/>
+          <w:lang w:eastAsia="pt-BR"/>
+        </w:rPr>
+        <w:t xml:space="preserve"> C.cidade = 'rio de janeiro' </w:t>
+      </w:r>
+    </w:p>
+    <w:p>
+      <w:pPr>
+        <w:rPr>
+          <w:noProof/>
+          <w:lang w:eastAsia="pt-BR"/>
+        </w:rPr>
+      </w:pPr>
+      <w:hyperlink r:id="rId18" w:tgtFrame="mysql_doc" w:history="1">
+        <w:r>
+          <w:rPr>
+            <w:rStyle w:val="Hyperlink"/>
+            <w:noProof/>
+            <w:lang w:eastAsia="pt-BR"/>
+          </w:rPr>
+          <w:t>AND</w:t>
+        </w:r>
+      </w:hyperlink>
+      <w:r>
+        <w:rPr>
+          <w:noProof/>
+          <w:lang w:eastAsia="pt-BR"/>
+        </w:rPr>
+        <w:t xml:space="preserve"> PR.desc_prod = 'Chapa de Aco' </w:t>
+      </w:r>
+      <w:hyperlink r:id="rId19" w:tgtFrame="mysql_doc" w:history="1">
+        <w:r>
+          <w:rPr>
+            <w:rStyle w:val="Hyperlink"/>
+            <w:noProof/>
+            <w:lang w:eastAsia="pt-BR"/>
+          </w:rPr>
+          <w:t>AND</w:t>
+        </w:r>
+      </w:hyperlink>
+      <w:r>
+        <w:rPr>
+          <w:noProof/>
+          <w:lang w:eastAsia="pt-BR"/>
+        </w:rPr>
+        <w:t xml:space="preserve"> P.prazo_entr &gt; 15 </w:t>
+      </w:r>
+    </w:p>
+    <w:p>
+      <w:pPr>
+        <w:rPr>
+          <w:noProof/>
+          <w:lang w:eastAsia="pt-BR"/>
+        </w:rPr>
+      </w:pPr>
+      <w:r>
+        <w:rPr>
+          <w:noProof/>
+          <w:lang w:eastAsia="pt-BR"/>
+        </w:rPr>
+        <w:t>ORDER BY C.nome_cli;</w:t>
+      </w:r>
+    </w:p>
+    <w:p>
+      <w:pPr>
+        <w:ind w:firstLine="0"/>
+        <w:rPr>
+          <w:noProof/>
+          <w:lang w:eastAsia="pt-BR"/>
+        </w:rPr>
+      </w:pPr>
+      <w:r>
+        <w:rPr>
+          <w:noProof/>
+          <w:lang w:eastAsia="pt-BR"/>
+        </w:rPr>
+        <w:drawing>
+          <wp:inline distT="0" distB="0" distL="0" distR="0" wp14:anchorId="2B509179" wp14:editId="75688715">
+            <wp:extent cx="5760085" cy="881380"/>
+            <wp:effectExtent l="0" t="0" r="0" b="0"/>
+            <wp:docPr id="6" name="Imagem 6"/>
+            <wp:cNvGraphicFramePr>
+              <a:graphicFrameLocks xmlns:a="http://schemas.openxmlformats.org/drawingml/2006/main" noChangeAspect="1"/>
+            </wp:cNvGraphicFramePr>
+            <a:graphic xmlns:a="http://schemas.openxmlformats.org/drawingml/2006/main">
+              <a:graphicData uri="http://schemas.openxmlformats.org/drawingml/2006/picture">
+                <pic:pic xmlns:pic="http://schemas.openxmlformats.org/drawingml/2006/picture">
+                  <pic:nvPicPr>
+                    <pic:cNvPr id="1" name=""/>
+                    <pic:cNvPicPr/>
+                  </pic:nvPicPr>
+                  <pic:blipFill>
+                    <a:blip r:embed="rId20"/>
+                    <a:stretch>
+                      <a:fillRect/>
+                    </a:stretch>
+                  </pic:blipFill>
+                  <pic:spPr>
+                    <a:xfrm>
+                      <a:off x="0" y="0"/>
+                      <a:ext cx="5760085" cy="881380"/>
+                    </a:xfrm>
+                    <a:prstGeom prst="rect">
+                      <a:avLst/>
+                    </a:prstGeom>
+                  </pic:spPr>
+                </pic:pic>
+              </a:graphicData>
+            </a:graphic>
+          </wp:inline>
+        </w:drawing>
+      </w:r>
+    </w:p>
+    <w:p>
+      <w:pPr>
+        <w:rPr>
+          <w:noProof/>
+          <w:lang w:eastAsia="pt-BR"/>
+        </w:rPr>
+      </w:pPr>
     </w:p>
     <w:p>
       <w:pPr>
@@ -1222,69 +1865,269 @@
     <w:p>
       <w:pPr>
         <w:rPr>
-          <w:noProof/>
-          <w:lang w:eastAsia="pt-BR"/>
-        </w:rPr>
-      </w:pPr>
-      <w:r>
-        <w:rPr>
+          <w:b/>
+          <w:bCs/>
+          <w:noProof/>
+          <w:lang w:eastAsia="pt-BR"/>
+        </w:rPr>
+      </w:pPr>
+      <w:r>
+        <w:rPr>
+          <w:b/>
+          <w:bCs/>
           <w:noProof/>
           <w:lang w:eastAsia="pt-BR"/>
         </w:rPr>
         <w:lastRenderedPageBreak/>
-        <w:t xml:space="preserve">Questao 8 - </w:t>
-      </w:r>
-      <w:r>
-        <w:rPr>
-          <w:noProof/>
-          <w:lang w:eastAsia="pt-BR"/>
-        </w:rPr>
-        <w:t>Problema:</w:t>
-      </w:r>
-    </w:p>
-    <w:p>
-      <w:pPr>
-        <w:rPr>
-          <w:noProof/>
-          <w:lang w:eastAsia="pt-BR"/>
-        </w:rPr>
-      </w:pPr>
-      <w:r>
-        <w:rPr>
-          <w:noProof/>
-          <w:lang w:eastAsia="pt-BR"/>
-        </w:rPr>
-        <w:t>Quantos clientes das cidades do Rio de Janeiro e Niterói tiveram seus pedidos tirados com a vendedora Ana Cristina?</w:t>
-      </w:r>
-    </w:p>
-    <w:p>
-      <w:pPr>
-        <w:rPr>
-          <w:noProof/>
-          <w:lang w:eastAsia="pt-BR"/>
-        </w:rPr>
-      </w:pPr>
-      <w:r>
-        <w:rPr>
-          <w:noProof/>
-          <w:lang w:eastAsia="pt-BR"/>
-        </w:rPr>
-        <w:t>select C.cidade, count (distinct cod_cli) as num_clientes from cliente C, pedido P, vendedor V where C.cod_cli=P.cd_cli and C.cidade in ('rio de janeiro', 'niteroi') and p.cd_vend=V.cod_vend and V.nome_vend='Ana Cristina'</w:t>
-      </w:r>
-    </w:p>
-    <w:p>
-      <w:pPr>
-        <w:rPr>
-          <w:noProof/>
-          <w:lang w:eastAsia="pt-BR"/>
-        </w:rPr>
-      </w:pPr>
-      <w:r>
-        <w:rPr>
-          <w:noProof/>
-          <w:lang w:eastAsia="pt-BR"/>
-        </w:rPr>
-        <w:t>group by C.cidade;</w:t>
+        <w:t xml:space="preserve">Questão </w:t>
+      </w:r>
+      <w:r>
+        <w:rPr>
+          <w:b/>
+          <w:bCs/>
+          <w:noProof/>
+          <w:lang w:eastAsia="pt-BR"/>
+        </w:rPr>
+        <w:t>0</w:t>
+      </w:r>
+      <w:r>
+        <w:rPr>
+          <w:b/>
+          <w:bCs/>
+          <w:noProof/>
+          <w:lang w:eastAsia="pt-BR"/>
+        </w:rPr>
+        <w:t>7</w:t>
+      </w:r>
+      <w:r>
+        <w:rPr>
+          <w:b/>
+          <w:bCs/>
+          <w:noProof/>
+          <w:lang w:eastAsia="pt-BR"/>
+        </w:rPr>
+        <w:t xml:space="preserve"> Join</w:t>
+      </w:r>
+      <w:r>
+        <w:rPr>
+          <w:b/>
+          <w:bCs/>
+          <w:noProof/>
+          <w:lang w:eastAsia="pt-BR"/>
+        </w:rPr>
+        <w:t xml:space="preserve"> - Problema:</w:t>
+      </w:r>
+    </w:p>
+    <w:p>
+      <w:pPr>
+        <w:rPr>
+          <w:noProof/>
+          <w:lang w:eastAsia="pt-BR"/>
+        </w:rPr>
+      </w:pPr>
+      <w:r>
+        <w:rPr>
+          <w:noProof/>
+          <w:lang w:eastAsia="pt-BR"/>
+        </w:rPr>
+        <w:t>Mostre os nome de todos os vendedores que venderam Chapa de Aco em quantidade superior a 300 Kg.</w:t>
+      </w:r>
+    </w:p>
+    <w:p>
+      <w:pPr>
+        <w:rPr>
+          <w:noProof/>
+          <w:lang w:eastAsia="pt-BR"/>
+        </w:rPr>
+      </w:pPr>
+      <w:hyperlink r:id="rId21" w:tgtFrame="mysql_doc" w:history="1">
+        <w:r>
+          <w:rPr>
+            <w:rStyle w:val="Hyperlink"/>
+            <w:noProof/>
+            <w:lang w:eastAsia="pt-BR"/>
+          </w:rPr>
+          <w:t>SELECT</w:t>
+        </w:r>
+      </w:hyperlink>
+      <w:r>
+        <w:rPr>
+          <w:noProof/>
+          <w:lang w:eastAsia="pt-BR"/>
+        </w:rPr>
+        <w:t xml:space="preserve"> DISTINCT V.nome_vend </w:t>
+      </w:r>
+    </w:p>
+    <w:p>
+      <w:pPr>
+        <w:rPr>
+          <w:noProof/>
+          <w:lang w:eastAsia="pt-BR"/>
+        </w:rPr>
+      </w:pPr>
+      <w:r>
+        <w:rPr>
+          <w:noProof/>
+          <w:lang w:eastAsia="pt-BR"/>
+        </w:rPr>
+        <w:t>FROM vendedor V, pedido P, item_pedido I, produto PR</w:t>
+      </w:r>
+    </w:p>
+    <w:p>
+      <w:pPr>
+        <w:rPr>
+          <w:noProof/>
+          <w:lang w:eastAsia="pt-BR"/>
+        </w:rPr>
+      </w:pPr>
+      <w:r>
+        <w:rPr>
+          <w:noProof/>
+          <w:lang w:eastAsia="pt-BR"/>
+        </w:rPr>
+        <w:t xml:space="preserve"> WHERE V.cod_vend = P.cd_vend </w:t>
+      </w:r>
+    </w:p>
+    <w:p>
+      <w:pPr>
+        <w:rPr>
+          <w:noProof/>
+          <w:lang w:eastAsia="pt-BR"/>
+        </w:rPr>
+      </w:pPr>
+      <w:hyperlink r:id="rId22" w:tgtFrame="mysql_doc" w:history="1">
+        <w:r>
+          <w:rPr>
+            <w:rStyle w:val="Hyperlink"/>
+            <w:noProof/>
+            <w:lang w:eastAsia="pt-BR"/>
+          </w:rPr>
+          <w:t>AND</w:t>
+        </w:r>
+      </w:hyperlink>
+      <w:r>
+        <w:rPr>
+          <w:noProof/>
+          <w:lang w:eastAsia="pt-BR"/>
+        </w:rPr>
+        <w:t xml:space="preserve"> P.num_ped = I.no_ped </w:t>
+      </w:r>
+      <w:hyperlink r:id="rId23" w:tgtFrame="mysql_doc" w:history="1">
+        <w:r>
+          <w:rPr>
+            <w:rStyle w:val="Hyperlink"/>
+            <w:noProof/>
+            <w:lang w:eastAsia="pt-BR"/>
+          </w:rPr>
+          <w:t>AND</w:t>
+        </w:r>
+      </w:hyperlink>
+      <w:r>
+        <w:rPr>
+          <w:noProof/>
+          <w:lang w:eastAsia="pt-BR"/>
+        </w:rPr>
+        <w:t xml:space="preserve"> I.cd_prod = PR.cod_prod </w:t>
+      </w:r>
+    </w:p>
+    <w:p>
+      <w:pPr>
+        <w:rPr>
+          <w:noProof/>
+          <w:lang w:eastAsia="pt-BR"/>
+        </w:rPr>
+      </w:pPr>
+      <w:hyperlink r:id="rId24" w:tgtFrame="mysql_doc" w:history="1">
+        <w:r>
+          <w:rPr>
+            <w:rStyle w:val="Hyperlink"/>
+            <w:noProof/>
+            <w:lang w:eastAsia="pt-BR"/>
+          </w:rPr>
+          <w:t>AND</w:t>
+        </w:r>
+      </w:hyperlink>
+      <w:r>
+        <w:rPr>
+          <w:noProof/>
+          <w:lang w:eastAsia="pt-BR"/>
+        </w:rPr>
+        <w:t xml:space="preserve"> PR.desc_prod = 'Chapa de Aco' </w:t>
+      </w:r>
+      <w:hyperlink r:id="rId25" w:tgtFrame="mysql_doc" w:history="1">
+        <w:r>
+          <w:rPr>
+            <w:rStyle w:val="Hyperlink"/>
+            <w:noProof/>
+            <w:lang w:eastAsia="pt-BR"/>
+          </w:rPr>
+          <w:t>AND</w:t>
+        </w:r>
+      </w:hyperlink>
+      <w:r>
+        <w:rPr>
+          <w:noProof/>
+          <w:lang w:eastAsia="pt-BR"/>
+        </w:rPr>
+        <w:t xml:space="preserve"> I.qtd_ped &gt; 300;</w:t>
+      </w:r>
+    </w:p>
+    <w:p>
+      <w:pPr>
+        <w:rPr>
+          <w:noProof/>
+          <w:lang w:eastAsia="pt-BR"/>
+        </w:rPr>
+      </w:pPr>
+    </w:p>
+    <w:p>
+      <w:pPr>
+        <w:ind w:firstLine="0"/>
+        <w:rPr>
+          <w:noProof/>
+          <w:lang w:eastAsia="pt-BR"/>
+        </w:rPr>
+      </w:pPr>
+      <w:r>
+        <w:rPr>
+          <w:noProof/>
+          <w:lang w:eastAsia="pt-BR"/>
+        </w:rPr>
+        <w:drawing>
+          <wp:inline distT="0" distB="0" distL="0" distR="0" wp14:anchorId="5FFFFADA" wp14:editId="512A18E1">
+            <wp:extent cx="5760085" cy="962025"/>
+            <wp:effectExtent l="0" t="0" r="0" b="9525"/>
+            <wp:docPr id="7" name="Imagem 7"/>
+            <wp:cNvGraphicFramePr>
+              <a:graphicFrameLocks xmlns:a="http://schemas.openxmlformats.org/drawingml/2006/main" noChangeAspect="1"/>
+            </wp:cNvGraphicFramePr>
+            <a:graphic xmlns:a="http://schemas.openxmlformats.org/drawingml/2006/main">
+              <a:graphicData uri="http://schemas.openxmlformats.org/drawingml/2006/picture">
+                <pic:pic xmlns:pic="http://schemas.openxmlformats.org/drawingml/2006/picture">
+                  <pic:nvPicPr>
+                    <pic:cNvPr id="1" name=""/>
+                    <pic:cNvPicPr/>
+                  </pic:nvPicPr>
+                  <pic:blipFill>
+                    <a:blip r:embed="rId26"/>
+                    <a:stretch>
+                      <a:fillRect/>
+                    </a:stretch>
+                  </pic:blipFill>
+                  <pic:spPr>
+                    <a:xfrm>
+                      <a:off x="0" y="0"/>
+                      <a:ext cx="5760085" cy="962025"/>
+                    </a:xfrm>
+                    <a:prstGeom prst="rect">
+                      <a:avLst/>
+                    </a:prstGeom>
+                  </pic:spPr>
+                </pic:pic>
+              </a:graphicData>
+            </a:graphic>
+          </wp:inline>
+        </w:drawing>
       </w:r>
     </w:p>
     <w:p>
@@ -1315,7 +2158,6 @@
     </w:p>
     <w:p>
       <w:pPr>
-        <w:ind w:firstLine="0"/>
         <w:rPr>
           <w:b/>
           <w:bCs/>
@@ -1331,65 +2173,145 @@
           <w:lang w:eastAsia="pt-BR"/>
         </w:rPr>
         <w:lastRenderedPageBreak/>
-        <w:t>Utilizando Consultas Aninhadas (Subqueries)</w:t>
-      </w:r>
-    </w:p>
-    <w:p>
-      <w:pPr>
-        <w:rPr>
-          <w:noProof/>
-          <w:lang w:eastAsia="pt-BR"/>
-        </w:rPr>
-      </w:pPr>
-      <w:r>
-        <w:rPr>
-          <w:noProof/>
-          <w:lang w:eastAsia="pt-BR"/>
-        </w:rPr>
-        <w:t>Chamamos de consulta aninhada à consulta cujo o resultado é utilizado por outra consulta, de forma encadeada e contida no mesmo comando SQL.</w:t>
-      </w:r>
-    </w:p>
-    <w:p>
-      <w:pPr>
-        <w:rPr>
-          <w:b/>
-          <w:bCs/>
-          <w:noProof/>
-          <w:lang w:eastAsia="pt-BR"/>
-        </w:rPr>
-      </w:pPr>
-      <w:r>
-        <w:rPr>
-          <w:b/>
-          <w:bCs/>
-          <w:noProof/>
-          <w:lang w:eastAsia="pt-BR"/>
-        </w:rPr>
-        <w:t xml:space="preserve">Questão 9 - </w:t>
-      </w:r>
-      <w:r>
-        <w:rPr>
-          <w:b/>
-          <w:bCs/>
-          <w:noProof/>
-          <w:lang w:eastAsia="pt-BR"/>
-        </w:rPr>
-        <w:t>Problema:</w:t>
-      </w:r>
-    </w:p>
-    <w:p>
-      <w:pPr>
-        <w:rPr>
-          <w:noProof/>
-          <w:lang w:eastAsia="pt-BR"/>
-        </w:rPr>
-      </w:pPr>
-      <w:r>
-        <w:rPr>
-          <w:noProof/>
-          <w:lang w:eastAsia="pt-BR"/>
-        </w:rPr>
-        <w:t>Que produtos estão incluídos em um pedido qualquer com a quantidade pedida igual a 100?</w:t>
+        <w:t xml:space="preserve">Questão </w:t>
+      </w:r>
+      <w:r>
+        <w:rPr>
+          <w:b/>
+          <w:bCs/>
+          <w:noProof/>
+          <w:lang w:eastAsia="pt-BR"/>
+        </w:rPr>
+        <w:t>0</w:t>
+      </w:r>
+      <w:r>
+        <w:rPr>
+          <w:b/>
+          <w:bCs/>
+          <w:noProof/>
+          <w:lang w:eastAsia="pt-BR"/>
+        </w:rPr>
+        <w:t>8</w:t>
+      </w:r>
+      <w:r>
+        <w:rPr>
+          <w:b/>
+          <w:bCs/>
+          <w:noProof/>
+          <w:lang w:eastAsia="pt-BR"/>
+        </w:rPr>
+        <w:t xml:space="preserve"> Join</w:t>
+      </w:r>
+      <w:r>
+        <w:rPr>
+          <w:b/>
+          <w:bCs/>
+          <w:noProof/>
+          <w:lang w:eastAsia="pt-BR"/>
+        </w:rPr>
+        <w:t xml:space="preserve"> - Problema:</w:t>
+      </w:r>
+    </w:p>
+    <w:p>
+      <w:pPr>
+        <w:rPr>
+          <w:noProof/>
+          <w:lang w:eastAsia="pt-BR"/>
+        </w:rPr>
+      </w:pPr>
+      <w:r>
+        <w:rPr>
+          <w:noProof/>
+          <w:lang w:eastAsia="pt-BR"/>
+        </w:rPr>
+        <w:t>Quantos clientes das cidades do Rio de Janeiro e Niterói tiveram seus pedidos tirados com a vendedora Ana Cristina?</w:t>
+      </w:r>
+    </w:p>
+    <w:p>
+      <w:pPr>
+        <w:rPr>
+          <w:noProof/>
+          <w:lang w:eastAsia="pt-BR"/>
+        </w:rPr>
+      </w:pPr>
+      <w:r>
+        <w:rPr>
+          <w:noProof/>
+          <w:lang w:eastAsia="pt-BR"/>
+        </w:rPr>
+        <w:t>select C.cidade, count (distinct cod_cli) as num_clientes from cliente C, pedido P, vendedor V where C.cod_cli=P.cd_cli and C.cidade in ('rio de janeiro', 'niteroi') and p.cd_vend=V.cod_vend and V.nome_vend='Ana Cristina'</w:t>
+      </w:r>
+    </w:p>
+    <w:p>
+      <w:pPr>
+        <w:rPr>
+          <w:noProof/>
+          <w:lang w:eastAsia="pt-BR"/>
+        </w:rPr>
+      </w:pPr>
+      <w:r>
+        <w:rPr>
+          <w:noProof/>
+          <w:lang w:eastAsia="pt-BR"/>
+        </w:rPr>
+        <w:t>group by C.cidade;</w:t>
+      </w:r>
+    </w:p>
+    <w:p>
+      <w:pPr>
+        <w:rPr>
+          <w:noProof/>
+          <w:lang w:eastAsia="pt-BR"/>
+        </w:rPr>
+      </w:pPr>
+    </w:p>
+    <w:p>
+      <w:pPr>
+        <w:rPr>
+          <w:noProof/>
+          <w:lang w:eastAsia="pt-BR"/>
+        </w:rPr>
+      </w:pPr>
+      <w:r>
+        <w:rPr>
+          <w:noProof/>
+          <w:lang w:eastAsia="pt-BR"/>
+        </w:rPr>
+        <w:drawing>
+          <wp:inline distT="0" distB="0" distL="0" distR="0" wp14:anchorId="3A6E2805" wp14:editId="2F02173E">
+            <wp:extent cx="2343477" cy="1800476"/>
+            <wp:effectExtent l="0" t="0" r="0" b="9525"/>
+            <wp:docPr id="8" name="Imagem 8"/>
+            <wp:cNvGraphicFramePr>
+              <a:graphicFrameLocks xmlns:a="http://schemas.openxmlformats.org/drawingml/2006/main" noChangeAspect="1"/>
+            </wp:cNvGraphicFramePr>
+            <a:graphic xmlns:a="http://schemas.openxmlformats.org/drawingml/2006/main">
+              <a:graphicData uri="http://schemas.openxmlformats.org/drawingml/2006/picture">
+                <pic:pic xmlns:pic="http://schemas.openxmlformats.org/drawingml/2006/picture">
+                  <pic:nvPicPr>
+                    <pic:cNvPr id="1" name=""/>
+                    <pic:cNvPicPr/>
+                  </pic:nvPicPr>
+                  <pic:blipFill>
+                    <a:blip r:embed="rId27"/>
+                    <a:stretch>
+                      <a:fillRect/>
+                    </a:stretch>
+                  </pic:blipFill>
+                  <pic:spPr>
+                    <a:xfrm>
+                      <a:off x="0" y="0"/>
+                      <a:ext cx="2343477" cy="1800476"/>
+                    </a:xfrm>
+                    <a:prstGeom prst="rect">
+                      <a:avLst/>
+                    </a:prstGeom>
+                  </pic:spPr>
+                </pic:pic>
+              </a:graphicData>
+            </a:graphic>
+          </wp:inline>
+        </w:drawing>
       </w:r>
     </w:p>
     <w:p>
@@ -1420,6 +2342,7 @@
     </w:p>
     <w:p>
       <w:pPr>
+        <w:ind w:firstLine="0"/>
         <w:rPr>
           <w:b/>
           <w:bCs/>
@@ -1435,48 +2358,271 @@
           <w:lang w:eastAsia="pt-BR"/>
         </w:rPr>
         <w:lastRenderedPageBreak/>
-        <w:t xml:space="preserve">Questão 10 - </w:t>
-      </w:r>
-      <w:r>
-        <w:rPr>
-          <w:b/>
-          <w:bCs/>
-          <w:noProof/>
-          <w:lang w:eastAsia="pt-BR"/>
-        </w:rPr>
-        <w:t>Problema:</w:t>
-      </w:r>
-    </w:p>
-    <w:p>
-      <w:pPr>
-        <w:rPr>
-          <w:noProof/>
-          <w:lang w:eastAsia="pt-BR"/>
-        </w:rPr>
-      </w:pPr>
-      <w:r>
-        <w:rPr>
-          <w:noProof/>
-          <w:lang w:eastAsia="pt-BR"/>
-        </w:rPr>
-        <w:t>Quais vendedores ganham um salário fixo abaixo da média?</w:t>
-      </w:r>
-    </w:p>
-    <w:p>
-      <w:pPr>
-        <w:rPr>
-          <w:noProof/>
-          <w:lang w:eastAsia="pt-BR"/>
-        </w:rPr>
-      </w:pPr>
-    </w:p>
-    <w:p>
-      <w:pPr>
-        <w:rPr>
-          <w:noProof/>
-          <w:lang w:eastAsia="pt-BR"/>
-        </w:rPr>
-      </w:pPr>
+        <w:t>Utilizando Consultas Aninhadas (Subqueries)</w:t>
+      </w:r>
+    </w:p>
+    <w:p>
+      <w:pPr>
+        <w:rPr>
+          <w:noProof/>
+          <w:lang w:eastAsia="pt-BR"/>
+        </w:rPr>
+      </w:pPr>
+      <w:r>
+        <w:rPr>
+          <w:noProof/>
+          <w:lang w:eastAsia="pt-BR"/>
+        </w:rPr>
+        <w:t>Chamamos de consulta aninhada à consulta cujo o resultado é utilizado por outra consulta, de forma encadeada e contida no mesmo comando SQL.</w:t>
+      </w:r>
+    </w:p>
+    <w:p>
+      <w:pPr>
+        <w:rPr>
+          <w:b/>
+          <w:bCs/>
+          <w:noProof/>
+          <w:lang w:eastAsia="pt-BR"/>
+        </w:rPr>
+      </w:pPr>
+      <w:r>
+        <w:rPr>
+          <w:b/>
+          <w:bCs/>
+          <w:noProof/>
+          <w:lang w:eastAsia="pt-BR"/>
+        </w:rPr>
+        <w:t xml:space="preserve">Questão </w:t>
+      </w:r>
+      <w:r>
+        <w:rPr>
+          <w:b/>
+          <w:bCs/>
+          <w:noProof/>
+          <w:lang w:eastAsia="pt-BR"/>
+        </w:rPr>
+        <w:t>09</w:t>
+      </w:r>
+      <w:r>
+        <w:rPr>
+          <w:b/>
+          <w:bCs/>
+          <w:noProof/>
+          <w:lang w:eastAsia="pt-BR"/>
+        </w:rPr>
+        <w:t xml:space="preserve"> </w:t>
+      </w:r>
+      <w:r>
+        <w:rPr>
+          <w:b/>
+          <w:bCs/>
+          <w:noProof/>
+          <w:lang w:eastAsia="pt-BR"/>
+        </w:rPr>
+        <w:t>Subqueries</w:t>
+      </w:r>
+      <w:r>
+        <w:rPr>
+          <w:b/>
+          <w:bCs/>
+          <w:noProof/>
+          <w:lang w:eastAsia="pt-BR"/>
+        </w:rPr>
+        <w:t xml:space="preserve"> - Problema:</w:t>
+      </w:r>
+    </w:p>
+    <w:p>
+      <w:pPr>
+        <w:rPr>
+          <w:noProof/>
+          <w:lang w:eastAsia="pt-BR"/>
+        </w:rPr>
+      </w:pPr>
+      <w:r>
+        <w:rPr>
+          <w:noProof/>
+          <w:lang w:eastAsia="pt-BR"/>
+        </w:rPr>
+        <w:t>Que produtos estão incluídos em um pedido qualquer com a quantidade pedida igual a 100?</w:t>
+      </w:r>
+    </w:p>
+    <w:p>
+      <w:pPr>
+        <w:rPr>
+          <w:noProof/>
+          <w:lang w:eastAsia="pt-BR"/>
+        </w:rPr>
+      </w:pPr>
+      <w:r>
+        <w:rPr>
+          <w:noProof/>
+          <w:lang w:eastAsia="pt-BR"/>
+        </w:rPr>
+        <w:t>SELECT desc_prod</w:t>
+      </w:r>
+    </w:p>
+    <w:p>
+      <w:pPr>
+        <w:rPr>
+          <w:noProof/>
+          <w:lang w:eastAsia="pt-BR"/>
+        </w:rPr>
+      </w:pPr>
+      <w:r>
+        <w:rPr>
+          <w:noProof/>
+          <w:lang w:eastAsia="pt-BR"/>
+        </w:rPr>
+        <w:t>FROM produto</w:t>
+      </w:r>
+    </w:p>
+    <w:p>
+      <w:pPr>
+        <w:rPr>
+          <w:noProof/>
+          <w:lang w:eastAsia="pt-BR"/>
+        </w:rPr>
+      </w:pPr>
+      <w:r>
+        <w:rPr>
+          <w:noProof/>
+          <w:lang w:eastAsia="pt-BR"/>
+        </w:rPr>
+        <w:t>WHERE cod_prod IN (</w:t>
+      </w:r>
+    </w:p>
+    <w:p>
+      <w:pPr>
+        <w:rPr>
+          <w:noProof/>
+          <w:lang w:eastAsia="pt-BR"/>
+        </w:rPr>
+      </w:pPr>
+      <w:r>
+        <w:rPr>
+          <w:noProof/>
+          <w:lang w:eastAsia="pt-BR"/>
+        </w:rPr>
+        <w:t>SELECT cd_prod</w:t>
+      </w:r>
+    </w:p>
+    <w:p>
+      <w:pPr>
+        <w:ind w:firstLine="0"/>
+        <w:rPr>
+          <w:noProof/>
+          <w:lang w:eastAsia="pt-BR"/>
+        </w:rPr>
+      </w:pPr>
+      <w:r>
+        <w:rPr>
+          <w:noProof/>
+          <w:lang w:eastAsia="pt-BR"/>
+        </w:rPr>
+        <w:t xml:space="preserve"> </w:t>
+      </w:r>
+      <w:r>
+        <w:rPr>
+          <w:noProof/>
+          <w:lang w:eastAsia="pt-BR"/>
+        </w:rPr>
+        <w:tab/>
+      </w:r>
+      <w:r>
+        <w:rPr>
+          <w:noProof/>
+          <w:lang w:eastAsia="pt-BR"/>
+        </w:rPr>
+        <w:t>FROM item_pedido</w:t>
+      </w:r>
+      <w:r>
+        <w:rPr>
+          <w:noProof/>
+          <w:lang w:eastAsia="pt-BR"/>
+        </w:rPr>
+        <w:tab/>
+      </w:r>
+    </w:p>
+    <w:p>
+      <w:pPr>
+        <w:ind w:firstLine="708"/>
+        <w:rPr>
+          <w:noProof/>
+          <w:lang w:eastAsia="pt-BR"/>
+        </w:rPr>
+      </w:pPr>
+      <w:r>
+        <w:rPr>
+          <w:noProof/>
+          <w:lang w:eastAsia="pt-BR"/>
+        </w:rPr>
+        <w:t>WHERE qtd_ped = 100</w:t>
+      </w:r>
+    </w:p>
+    <w:p>
+      <w:pPr>
+        <w:rPr>
+          <w:noProof/>
+          <w:lang w:eastAsia="pt-BR"/>
+        </w:rPr>
+      </w:pPr>
+      <w:r>
+        <w:rPr>
+          <w:noProof/>
+          <w:lang w:eastAsia="pt-BR"/>
+        </w:rPr>
+        <w:t>);</w:t>
+      </w:r>
+    </w:p>
+    <w:p>
+      <w:pPr>
+        <w:ind w:firstLine="0"/>
+        <w:rPr>
+          <w:noProof/>
+          <w:lang w:eastAsia="pt-BR"/>
+        </w:rPr>
+      </w:pPr>
+      <w:r>
+        <w:rPr>
+          <w:noProof/>
+          <w:lang w:eastAsia="pt-BR"/>
+        </w:rPr>
+        <w:drawing>
+          <wp:inline distT="0" distB="0" distL="0" distR="0" wp14:anchorId="4421805B" wp14:editId="0A1965DE">
+            <wp:extent cx="5760085" cy="2110105"/>
+            <wp:effectExtent l="0" t="0" r="0" b="4445"/>
+            <wp:docPr id="9" name="Imagem 9"/>
+            <wp:cNvGraphicFramePr>
+              <a:graphicFrameLocks xmlns:a="http://schemas.openxmlformats.org/drawingml/2006/main" noChangeAspect="1"/>
+            </wp:cNvGraphicFramePr>
+            <a:graphic xmlns:a="http://schemas.openxmlformats.org/drawingml/2006/main">
+              <a:graphicData uri="http://schemas.openxmlformats.org/drawingml/2006/picture">
+                <pic:pic xmlns:pic="http://schemas.openxmlformats.org/drawingml/2006/picture">
+                  <pic:nvPicPr>
+                    <pic:cNvPr id="1" name=""/>
+                    <pic:cNvPicPr/>
+                  </pic:nvPicPr>
+                  <pic:blipFill>
+                    <a:blip r:embed="rId28"/>
+                    <a:stretch>
+                      <a:fillRect/>
+                    </a:stretch>
+                  </pic:blipFill>
+                  <pic:spPr>
+                    <a:xfrm>
+                      <a:off x="0" y="0"/>
+                      <a:ext cx="5760085" cy="2110105"/>
+                    </a:xfrm>
+                    <a:prstGeom prst="rect">
+                      <a:avLst/>
+                    </a:prstGeom>
+                  </pic:spPr>
+                </pic:pic>
+              </a:graphicData>
+            </a:graphic>
+          </wp:inline>
+        </w:drawing>
+      </w:r>
     </w:p>
     <w:p>
       <w:pPr>
@@ -1521,32 +2667,189 @@
           <w:lang w:eastAsia="pt-BR"/>
         </w:rPr>
         <w:lastRenderedPageBreak/>
-        <w:t xml:space="preserve">Questão 11 - </w:t>
-      </w:r>
-      <w:r>
-        <w:rPr>
-          <w:b/>
-          <w:bCs/>
-          <w:noProof/>
-          <w:lang w:eastAsia="pt-BR"/>
-        </w:rPr>
-        <w:t>Problema:</w:t>
-      </w:r>
-    </w:p>
-    <w:p>
-      <w:pPr>
-        <w:rPr>
-          <w:noProof/>
-          <w:lang w:eastAsia="pt-BR"/>
-        </w:rPr>
-      </w:pPr>
-      <w:r>
-        <w:rPr>
-          <w:noProof/>
-          <w:lang w:eastAsia="pt-BR"/>
-        </w:rPr>
-        <w:t>Quais os produtos que não estão presentes em nenhum pedido?</w:t>
-      </w:r>
+        <w:t xml:space="preserve">Questão </w:t>
+      </w:r>
+      <w:r>
+        <w:rPr>
+          <w:b/>
+          <w:bCs/>
+          <w:noProof/>
+          <w:lang w:eastAsia="pt-BR"/>
+        </w:rPr>
+        <w:t>10 Subqueries</w:t>
+      </w:r>
+      <w:r>
+        <w:rPr>
+          <w:b/>
+          <w:bCs/>
+          <w:noProof/>
+          <w:lang w:eastAsia="pt-BR"/>
+        </w:rPr>
+        <w:t xml:space="preserve"> - Problema:</w:t>
+      </w:r>
+    </w:p>
+    <w:p>
+      <w:pPr>
+        <w:rPr>
+          <w:noProof/>
+          <w:lang w:eastAsia="pt-BR"/>
+        </w:rPr>
+      </w:pPr>
+      <w:r>
+        <w:rPr>
+          <w:noProof/>
+          <w:lang w:eastAsia="pt-BR"/>
+        </w:rPr>
+        <w:t>Quais vendedores ganham um salário fixo abaixo da média?</w:t>
+      </w:r>
+    </w:p>
+    <w:p>
+      <w:pPr>
+        <w:rPr>
+          <w:noProof/>
+          <w:lang w:eastAsia="pt-BR"/>
+        </w:rPr>
+      </w:pPr>
+      <w:r>
+        <w:rPr>
+          <w:noProof/>
+          <w:lang w:eastAsia="pt-BR"/>
+        </w:rPr>
+        <w:t>SELECT nome_vend, sal_fixo</w:t>
+      </w:r>
+    </w:p>
+    <w:p>
+      <w:pPr>
+        <w:rPr>
+          <w:noProof/>
+          <w:lang w:eastAsia="pt-BR"/>
+        </w:rPr>
+      </w:pPr>
+      <w:r>
+        <w:rPr>
+          <w:noProof/>
+          <w:lang w:eastAsia="pt-BR"/>
+        </w:rPr>
+        <w:t>FROM vendedor</w:t>
+      </w:r>
+    </w:p>
+    <w:p>
+      <w:pPr>
+        <w:rPr>
+          <w:noProof/>
+          <w:lang w:eastAsia="pt-BR"/>
+        </w:rPr>
+      </w:pPr>
+      <w:r>
+        <w:rPr>
+          <w:noProof/>
+          <w:lang w:eastAsia="pt-BR"/>
+        </w:rPr>
+        <w:t>WHERE sal_fixo &lt; (</w:t>
+      </w:r>
+    </w:p>
+    <w:p>
+      <w:pPr>
+        <w:rPr>
+          <w:noProof/>
+          <w:lang w:eastAsia="pt-BR"/>
+        </w:rPr>
+      </w:pPr>
+      <w:r>
+        <w:rPr>
+          <w:noProof/>
+          <w:lang w:eastAsia="pt-BR"/>
+        </w:rPr>
+        <w:t xml:space="preserve">    SELECT AVG(sal_fixo)</w:t>
+      </w:r>
+    </w:p>
+    <w:p>
+      <w:pPr>
+        <w:rPr>
+          <w:noProof/>
+          <w:lang w:eastAsia="pt-BR"/>
+        </w:rPr>
+      </w:pPr>
+      <w:r>
+        <w:rPr>
+          <w:noProof/>
+          <w:lang w:eastAsia="pt-BR"/>
+        </w:rPr>
+        <w:t xml:space="preserve">    FROM vendedor</w:t>
+      </w:r>
+    </w:p>
+    <w:p>
+      <w:pPr>
+        <w:rPr>
+          <w:noProof/>
+          <w:lang w:eastAsia="pt-BR"/>
+        </w:rPr>
+      </w:pPr>
+      <w:r>
+        <w:rPr>
+          <w:noProof/>
+          <w:lang w:eastAsia="pt-BR"/>
+        </w:rPr>
+        <w:t>);</w:t>
+      </w:r>
+    </w:p>
+    <w:p>
+      <w:pPr>
+        <w:ind w:firstLine="0"/>
+        <w:rPr>
+          <w:noProof/>
+          <w:lang w:eastAsia="pt-BR"/>
+        </w:rPr>
+      </w:pPr>
+      <w:r>
+        <w:rPr>
+          <w:noProof/>
+          <w:lang w:eastAsia="pt-BR"/>
+        </w:rPr>
+        <w:drawing>
+          <wp:inline distT="0" distB="0" distL="0" distR="0" wp14:anchorId="3EAF0213" wp14:editId="102D3979">
+            <wp:extent cx="5760085" cy="2266315"/>
+            <wp:effectExtent l="0" t="0" r="0" b="635"/>
+            <wp:docPr id="10" name="Imagem 10"/>
+            <wp:cNvGraphicFramePr>
+              <a:graphicFrameLocks xmlns:a="http://schemas.openxmlformats.org/drawingml/2006/main" noChangeAspect="1"/>
+            </wp:cNvGraphicFramePr>
+            <a:graphic xmlns:a="http://schemas.openxmlformats.org/drawingml/2006/main">
+              <a:graphicData uri="http://schemas.openxmlformats.org/drawingml/2006/picture">
+                <pic:pic xmlns:pic="http://schemas.openxmlformats.org/drawingml/2006/picture">
+                  <pic:nvPicPr>
+                    <pic:cNvPr id="1" name=""/>
+                    <pic:cNvPicPr/>
+                  </pic:nvPicPr>
+                  <pic:blipFill>
+                    <a:blip r:embed="rId29"/>
+                    <a:stretch>
+                      <a:fillRect/>
+                    </a:stretch>
+                  </pic:blipFill>
+                  <pic:spPr>
+                    <a:xfrm>
+                      <a:off x="0" y="0"/>
+                      <a:ext cx="5760085" cy="2266315"/>
+                    </a:xfrm>
+                    <a:prstGeom prst="rect">
+                      <a:avLst/>
+                    </a:prstGeom>
+                  </pic:spPr>
+                </pic:pic>
+              </a:graphicData>
+            </a:graphic>
+          </wp:inline>
+        </w:drawing>
+      </w:r>
+    </w:p>
+    <w:p>
+      <w:pPr>
+        <w:rPr>
+          <w:noProof/>
+          <w:lang w:eastAsia="pt-BR"/>
+        </w:rPr>
+      </w:pPr>
     </w:p>
     <w:p>
       <w:pPr>
@@ -1584,145 +2887,213 @@
     </w:p>
     <w:p>
       <w:pPr>
+        <w:rPr>
+          <w:b/>
+          <w:bCs/>
+          <w:noProof/>
+          <w:lang w:eastAsia="pt-BR"/>
+        </w:rPr>
+      </w:pPr>
+      <w:r>
+        <w:rPr>
+          <w:b/>
+          <w:bCs/>
+          <w:noProof/>
+          <w:lang w:eastAsia="pt-BR"/>
+        </w:rPr>
+        <w:lastRenderedPageBreak/>
+        <w:t xml:space="preserve">Questão </w:t>
+      </w:r>
+      <w:r>
+        <w:rPr>
+          <w:b/>
+          <w:bCs/>
+          <w:noProof/>
+          <w:lang w:eastAsia="pt-BR"/>
+        </w:rPr>
+        <w:t>1</w:t>
+      </w:r>
+      <w:r>
+        <w:rPr>
+          <w:b/>
+          <w:bCs/>
+          <w:noProof/>
+          <w:lang w:eastAsia="pt-BR"/>
+        </w:rPr>
+        <w:t>1</w:t>
+      </w:r>
+      <w:r>
+        <w:rPr>
+          <w:b/>
+          <w:bCs/>
+          <w:noProof/>
+          <w:lang w:eastAsia="pt-BR"/>
+        </w:rPr>
+        <w:t xml:space="preserve"> Subqueries</w:t>
+      </w:r>
+      <w:r>
+        <w:rPr>
+          <w:b/>
+          <w:bCs/>
+          <w:noProof/>
+          <w:lang w:eastAsia="pt-BR"/>
+        </w:rPr>
+        <w:t xml:space="preserve"> - Problema:</w:t>
+      </w:r>
+    </w:p>
+    <w:p>
+      <w:pPr>
+        <w:rPr>
+          <w:noProof/>
+          <w:lang w:eastAsia="pt-BR"/>
+        </w:rPr>
+      </w:pPr>
+      <w:r>
+        <w:rPr>
+          <w:noProof/>
+          <w:lang w:eastAsia="pt-BR"/>
+        </w:rPr>
+        <w:t>Quais os produtos que não estão presentes em nenhum pedido?</w:t>
+      </w:r>
+    </w:p>
+    <w:p>
+      <w:pPr>
+        <w:rPr>
+          <w:noProof/>
+          <w:lang w:eastAsia="pt-BR"/>
+        </w:rPr>
+      </w:pPr>
+      <w:r>
+        <w:rPr>
+          <w:noProof/>
+          <w:lang w:eastAsia="pt-BR"/>
+        </w:rPr>
+        <w:t>SELECT desc_prod</w:t>
+      </w:r>
+    </w:p>
+    <w:p>
+      <w:pPr>
+        <w:rPr>
+          <w:noProof/>
+          <w:lang w:eastAsia="pt-BR"/>
+        </w:rPr>
+      </w:pPr>
+      <w:r>
+        <w:rPr>
+          <w:noProof/>
+          <w:lang w:eastAsia="pt-BR"/>
+        </w:rPr>
+        <w:t>FROM produto</w:t>
+      </w:r>
+    </w:p>
+    <w:p>
+      <w:pPr>
+        <w:rPr>
+          <w:noProof/>
+          <w:lang w:eastAsia="pt-BR"/>
+        </w:rPr>
+      </w:pPr>
+      <w:r>
+        <w:rPr>
+          <w:noProof/>
+          <w:lang w:eastAsia="pt-BR"/>
+        </w:rPr>
+        <w:t>WHERE cod_prod NOT IN (</w:t>
+      </w:r>
+    </w:p>
+    <w:p>
+      <w:pPr>
+        <w:rPr>
+          <w:noProof/>
+          <w:lang w:eastAsia="pt-BR"/>
+        </w:rPr>
+      </w:pPr>
+      <w:r>
+        <w:rPr>
+          <w:noProof/>
+          <w:lang w:eastAsia="pt-BR"/>
+        </w:rPr>
+        <w:t xml:space="preserve">    SELECT cd_prod</w:t>
+      </w:r>
+    </w:p>
+    <w:p>
+      <w:pPr>
+        <w:rPr>
+          <w:noProof/>
+          <w:lang w:eastAsia="pt-BR"/>
+        </w:rPr>
+      </w:pPr>
+      <w:r>
+        <w:rPr>
+          <w:noProof/>
+          <w:lang w:eastAsia="pt-BR"/>
+        </w:rPr>
+        <w:t xml:space="preserve">    FROM item_pedido</w:t>
+      </w:r>
+    </w:p>
+    <w:p>
+      <w:pPr>
+        <w:rPr>
+          <w:noProof/>
+          <w:lang w:eastAsia="pt-BR"/>
+        </w:rPr>
+      </w:pPr>
+      <w:r>
+        <w:rPr>
+          <w:noProof/>
+          <w:lang w:eastAsia="pt-BR"/>
+        </w:rPr>
+        <w:t>);</w:t>
+      </w:r>
+    </w:p>
+    <w:p>
+      <w:pPr>
         <w:ind w:firstLine="0"/>
         <w:rPr>
-          <w:b/>
-          <w:bCs/>
-          <w:noProof/>
-          <w:lang w:eastAsia="pt-BR"/>
-        </w:rPr>
-      </w:pPr>
-      <w:r>
-        <w:rPr>
-          <w:b/>
-          <w:bCs/>
-          <w:noProof/>
-          <w:lang w:eastAsia="pt-BR"/>
-        </w:rPr>
-        <w:lastRenderedPageBreak/>
-        <w:t>Inserindo Registros Usando um SELECT</w:t>
-      </w:r>
-    </w:p>
-    <w:p>
-      <w:pPr>
-        <w:ind w:firstLine="0"/>
-        <w:rPr>
-          <w:b/>
-          <w:bCs/>
-          <w:noProof/>
-          <w:lang w:eastAsia="pt-BR"/>
-        </w:rPr>
-      </w:pPr>
-    </w:p>
-    <w:p>
-      <w:pPr>
-        <w:rPr>
-          <w:noProof/>
-          <w:lang w:eastAsia="pt-BR"/>
-        </w:rPr>
-      </w:pPr>
-      <w:r>
-        <w:rPr>
-          <w:noProof/>
-          <w:lang w:eastAsia="pt-BR"/>
-        </w:rPr>
-        <w:t>INSERT INTO &lt;nome_tabela&gt; (&lt;lista_de_colunas&gt;)</w:t>
-      </w:r>
-    </w:p>
-    <w:p>
-      <w:pPr>
-        <w:rPr>
-          <w:noProof/>
-          <w:lang w:eastAsia="pt-BR"/>
-        </w:rPr>
-      </w:pPr>
-      <w:r>
-        <w:rPr>
-          <w:noProof/>
-          <w:lang w:eastAsia="pt-BR"/>
-        </w:rPr>
-        <w:t>SELECT &lt;lista_de_colunas&gt;</w:t>
-      </w:r>
-    </w:p>
-    <w:p>
-      <w:pPr>
-        <w:rPr>
-          <w:noProof/>
-          <w:lang w:eastAsia="pt-BR"/>
-        </w:rPr>
-      </w:pPr>
-      <w:r>
-        <w:rPr>
-          <w:noProof/>
-          <w:lang w:eastAsia="pt-BR"/>
-        </w:rPr>
-        <w:t>FROM &lt;nome_tabela&gt;</w:t>
-      </w:r>
-    </w:p>
-    <w:p>
-      <w:pPr>
-        <w:rPr>
-          <w:noProof/>
-          <w:lang w:eastAsia="pt-BR"/>
-        </w:rPr>
-      </w:pPr>
-      <w:r>
-        <w:rPr>
-          <w:noProof/>
-          <w:lang w:eastAsia="pt-BR"/>
-        </w:rPr>
-        <w:t>WHERE &lt;condição_de_seleção&gt;;</w:t>
-      </w:r>
-    </w:p>
-    <w:p>
-      <w:pPr>
-        <w:rPr>
-          <w:noProof/>
-          <w:lang w:eastAsia="pt-BR"/>
-        </w:rPr>
-      </w:pPr>
-    </w:p>
-    <w:p>
-      <w:pPr>
-        <w:rPr>
-          <w:b/>
-          <w:bCs/>
-          <w:noProof/>
-          <w:lang w:eastAsia="pt-BR"/>
-        </w:rPr>
-      </w:pPr>
-      <w:r>
-        <w:rPr>
-          <w:b/>
-          <w:bCs/>
-          <w:noProof/>
-          <w:lang w:eastAsia="pt-BR"/>
-        </w:rPr>
-        <w:t xml:space="preserve">Questão 12 Select e Insert - </w:t>
-      </w:r>
-      <w:r>
-        <w:rPr>
-          <w:b/>
-          <w:bCs/>
-          <w:noProof/>
-          <w:lang w:eastAsia="pt-BR"/>
-        </w:rPr>
-        <w:t>Problema:</w:t>
-      </w:r>
-    </w:p>
-    <w:p>
-      <w:pPr>
-        <w:rPr>
-          <w:noProof/>
-          <w:lang w:eastAsia="pt-BR"/>
-        </w:rPr>
-      </w:pPr>
-      <w:r>
-        <w:rPr>
-          <w:noProof/>
-          <w:lang w:eastAsia="pt-BR"/>
-        </w:rPr>
-        <w:t>Cadastrar como clientes os vendedores que emitiram mais de 3 pedidos. Usar para o código de cliente o mesmo código do vendedor. O restante das colunas devem ser preenchidas com um espaço em branco.</w:t>
+          <w:noProof/>
+          <w:lang w:eastAsia="pt-BR"/>
+        </w:rPr>
+      </w:pPr>
+      <w:r>
+        <w:rPr>
+          <w:noProof/>
+          <w:lang w:eastAsia="pt-BR"/>
+        </w:rPr>
+        <w:drawing>
+          <wp:inline distT="0" distB="0" distL="0" distR="0" wp14:anchorId="15DDCDBB" wp14:editId="3239775B">
+            <wp:extent cx="5760085" cy="873760"/>
+            <wp:effectExtent l="0" t="0" r="0" b="2540"/>
+            <wp:docPr id="11" name="Imagem 11"/>
+            <wp:cNvGraphicFramePr>
+              <a:graphicFrameLocks xmlns:a="http://schemas.openxmlformats.org/drawingml/2006/main" noChangeAspect="1"/>
+            </wp:cNvGraphicFramePr>
+            <a:graphic xmlns:a="http://schemas.openxmlformats.org/drawingml/2006/main">
+              <a:graphicData uri="http://schemas.openxmlformats.org/drawingml/2006/picture">
+                <pic:pic xmlns:pic="http://schemas.openxmlformats.org/drawingml/2006/picture">
+                  <pic:nvPicPr>
+                    <pic:cNvPr id="1" name=""/>
+                    <pic:cNvPicPr/>
+                  </pic:nvPicPr>
+                  <pic:blipFill>
+                    <a:blip r:embed="rId30"/>
+                    <a:stretch>
+                      <a:fillRect/>
+                    </a:stretch>
+                  </pic:blipFill>
+                  <pic:spPr>
+                    <a:xfrm>
+                      <a:off x="0" y="0"/>
+                      <a:ext cx="5760085" cy="873760"/>
+                    </a:xfrm>
+                    <a:prstGeom prst="rect">
+                      <a:avLst/>
+                    </a:prstGeom>
+                  </pic:spPr>
+                </pic:pic>
+              </a:graphicData>
+            </a:graphic>
+          </wp:inline>
+        </w:drawing>
       </w:r>
     </w:p>
     <w:p>
@@ -1761,6 +3132,7 @@
     </w:p>
     <w:p>
       <w:pPr>
+        <w:ind w:firstLine="0"/>
         <w:rPr>
           <w:b/>
           <w:bCs/>
@@ -1776,16 +3148,299 @@
           <w:lang w:eastAsia="pt-BR"/>
         </w:rPr>
         <w:lastRenderedPageBreak/>
-        <w:t xml:space="preserve">Questão 13 Update - </w:t>
-      </w:r>
-      <w:r>
-        <w:rPr>
-          <w:b/>
-          <w:bCs/>
-          <w:noProof/>
-          <w:lang w:eastAsia="pt-BR"/>
-        </w:rPr>
-        <w:t>Problema:</w:t>
+        <w:t>Inserindo Registros Usando um SELECT</w:t>
+      </w:r>
+    </w:p>
+    <w:p>
+      <w:pPr>
+        <w:ind w:firstLine="0"/>
+        <w:rPr>
+          <w:b/>
+          <w:bCs/>
+          <w:noProof/>
+          <w:lang w:eastAsia="pt-BR"/>
+        </w:rPr>
+      </w:pPr>
+    </w:p>
+    <w:p>
+      <w:pPr>
+        <w:rPr>
+          <w:noProof/>
+          <w:lang w:eastAsia="pt-BR"/>
+        </w:rPr>
+      </w:pPr>
+      <w:r>
+        <w:rPr>
+          <w:noProof/>
+          <w:lang w:eastAsia="pt-BR"/>
+        </w:rPr>
+        <w:t>INSERT INTO &lt;nome_tabela&gt; (&lt;lista_de_colunas&gt;)</w:t>
+      </w:r>
+    </w:p>
+    <w:p>
+      <w:pPr>
+        <w:rPr>
+          <w:noProof/>
+          <w:lang w:eastAsia="pt-BR"/>
+        </w:rPr>
+      </w:pPr>
+      <w:r>
+        <w:rPr>
+          <w:noProof/>
+          <w:lang w:eastAsia="pt-BR"/>
+        </w:rPr>
+        <w:t>SELECT &lt;lista_de_colunas&gt;</w:t>
+      </w:r>
+    </w:p>
+    <w:p>
+      <w:pPr>
+        <w:rPr>
+          <w:noProof/>
+          <w:lang w:eastAsia="pt-BR"/>
+        </w:rPr>
+      </w:pPr>
+      <w:r>
+        <w:rPr>
+          <w:noProof/>
+          <w:lang w:eastAsia="pt-BR"/>
+        </w:rPr>
+        <w:t>FROM &lt;nome_tabela&gt;</w:t>
+      </w:r>
+    </w:p>
+    <w:p>
+      <w:pPr>
+        <w:rPr>
+          <w:noProof/>
+          <w:lang w:eastAsia="pt-BR"/>
+        </w:rPr>
+      </w:pPr>
+      <w:r>
+        <w:rPr>
+          <w:noProof/>
+          <w:lang w:eastAsia="pt-BR"/>
+        </w:rPr>
+        <w:t>WHERE &lt;condição_de_seleção&gt;;</w:t>
+      </w:r>
+    </w:p>
+    <w:p>
+      <w:pPr>
+        <w:rPr>
+          <w:noProof/>
+          <w:lang w:eastAsia="pt-BR"/>
+        </w:rPr>
+      </w:pPr>
+    </w:p>
+    <w:p>
+      <w:pPr>
+        <w:rPr>
+          <w:b/>
+          <w:bCs/>
+          <w:noProof/>
+          <w:lang w:eastAsia="pt-BR"/>
+        </w:rPr>
+      </w:pPr>
+      <w:r>
+        <w:rPr>
+          <w:b/>
+          <w:bCs/>
+          <w:noProof/>
+          <w:lang w:eastAsia="pt-BR"/>
+        </w:rPr>
+        <w:t>Questão 12 Select e Insert - Problema:</w:t>
+      </w:r>
+    </w:p>
+    <w:p>
+      <w:pPr>
+        <w:rPr>
+          <w:noProof/>
+          <w:lang w:eastAsia="pt-BR"/>
+        </w:rPr>
+      </w:pPr>
+      <w:r>
+        <w:rPr>
+          <w:noProof/>
+          <w:lang w:eastAsia="pt-BR"/>
+        </w:rPr>
+        <w:t>Cadastrar como clientes os vendedores que emitiram mais de 3 pedidos. Usar para o código de cliente o mesmo código do vendedor. O restante das colunas devem ser preenchidas com um espaço em branco.</w:t>
+      </w:r>
+    </w:p>
+    <w:p>
+      <w:pPr>
+        <w:rPr>
+          <w:noProof/>
+          <w:lang w:eastAsia="pt-BR"/>
+        </w:rPr>
+      </w:pPr>
+      <w:r>
+        <w:rPr>
+          <w:noProof/>
+          <w:lang w:eastAsia="pt-BR"/>
+        </w:rPr>
+        <w:t>SELECT V.cod_vend, V.nome_vend</w:t>
+      </w:r>
+    </w:p>
+    <w:p>
+      <w:pPr>
+        <w:rPr>
+          <w:noProof/>
+          <w:lang w:eastAsia="pt-BR"/>
+        </w:rPr>
+      </w:pPr>
+      <w:r>
+        <w:rPr>
+          <w:noProof/>
+          <w:lang w:eastAsia="pt-BR"/>
+        </w:rPr>
+        <w:t>FROM vendedor V, pedido P</w:t>
+      </w:r>
+    </w:p>
+    <w:p>
+      <w:pPr>
+        <w:rPr>
+          <w:noProof/>
+          <w:lang w:eastAsia="pt-BR"/>
+        </w:rPr>
+      </w:pPr>
+      <w:r>
+        <w:rPr>
+          <w:noProof/>
+          <w:lang w:eastAsia="pt-BR"/>
+        </w:rPr>
+        <w:t>WHERE V.cod_vend = P.cd_vend</w:t>
+      </w:r>
+    </w:p>
+    <w:p>
+      <w:pPr>
+        <w:rPr>
+          <w:noProof/>
+          <w:lang w:eastAsia="pt-BR"/>
+        </w:rPr>
+      </w:pPr>
+      <w:r>
+        <w:rPr>
+          <w:noProof/>
+          <w:lang w:eastAsia="pt-BR"/>
+        </w:rPr>
+        <w:t>GROUP BY V.cod_vend, V.nome_vend</w:t>
+      </w:r>
+    </w:p>
+    <w:p>
+      <w:pPr>
+        <w:rPr>
+          <w:noProof/>
+          <w:lang w:eastAsia="pt-BR"/>
+        </w:rPr>
+      </w:pPr>
+      <w:r>
+        <w:rPr>
+          <w:noProof/>
+          <w:lang w:eastAsia="pt-BR"/>
+        </w:rPr>
+        <w:t>HAVING COUNT(P.num_ped) &gt; 3;</w:t>
+      </w:r>
+    </w:p>
+    <w:p>
+      <w:pPr>
+        <w:ind w:firstLine="0"/>
+        <w:rPr>
+          <w:noProof/>
+          <w:lang w:eastAsia="pt-BR"/>
+        </w:rPr>
+      </w:pPr>
+      <w:r>
+        <w:rPr>
+          <w:noProof/>
+          <w:lang w:eastAsia="pt-BR"/>
+        </w:rPr>
+        <w:drawing>
+          <wp:inline distT="0" distB="0" distL="0" distR="0" wp14:anchorId="36B92C99" wp14:editId="0547D60A">
+            <wp:extent cx="5760085" cy="1419225"/>
+            <wp:effectExtent l="0" t="0" r="0" b="9525"/>
+            <wp:docPr id="13" name="Imagem 13"/>
+            <wp:cNvGraphicFramePr>
+              <a:graphicFrameLocks xmlns:a="http://schemas.openxmlformats.org/drawingml/2006/main" noChangeAspect="1"/>
+            </wp:cNvGraphicFramePr>
+            <a:graphic xmlns:a="http://schemas.openxmlformats.org/drawingml/2006/main">
+              <a:graphicData uri="http://schemas.openxmlformats.org/drawingml/2006/picture">
+                <pic:pic xmlns:pic="http://schemas.openxmlformats.org/drawingml/2006/picture">
+                  <pic:nvPicPr>
+                    <pic:cNvPr id="1" name=""/>
+                    <pic:cNvPicPr/>
+                  </pic:nvPicPr>
+                  <pic:blipFill>
+                    <a:blip r:embed="rId31"/>
+                    <a:stretch>
+                      <a:fillRect/>
+                    </a:stretch>
+                  </pic:blipFill>
+                  <pic:spPr>
+                    <a:xfrm>
+                      <a:off x="0" y="0"/>
+                      <a:ext cx="5760085" cy="1419225"/>
+                    </a:xfrm>
+                    <a:prstGeom prst="rect">
+                      <a:avLst/>
+                    </a:prstGeom>
+                  </pic:spPr>
+                </pic:pic>
+              </a:graphicData>
+            </a:graphic>
+          </wp:inline>
+        </w:drawing>
+      </w:r>
+    </w:p>
+    <w:p>
+      <w:pPr>
+        <w:rPr>
+          <w:noProof/>
+          <w:lang w:eastAsia="pt-BR"/>
+        </w:rPr>
+      </w:pPr>
+    </w:p>
+    <w:p>
+      <w:pPr>
+        <w:rPr>
+          <w:noProof/>
+          <w:lang w:eastAsia="pt-BR"/>
+        </w:rPr>
+      </w:pPr>
+    </w:p>
+    <w:p>
+      <w:pPr>
+        <w:spacing w:line="278" w:lineRule="auto"/>
+        <w:ind w:firstLine="0"/>
+        <w:jc w:val="left"/>
+        <w:rPr>
+          <w:noProof/>
+          <w:lang w:eastAsia="pt-BR"/>
+        </w:rPr>
+      </w:pPr>
+      <w:r>
+        <w:rPr>
+          <w:noProof/>
+          <w:lang w:eastAsia="pt-BR"/>
+        </w:rPr>
+        <w:br w:type="page"/>
+      </w:r>
+    </w:p>
+    <w:p>
+      <w:pPr>
+        <w:rPr>
+          <w:b/>
+          <w:bCs/>
+          <w:noProof/>
+          <w:lang w:eastAsia="pt-BR"/>
+        </w:rPr>
+      </w:pPr>
+      <w:r>
+        <w:rPr>
+          <w:b/>
+          <w:bCs/>
+          <w:noProof/>
+          <w:lang w:eastAsia="pt-BR"/>
+        </w:rPr>
+        <w:lastRenderedPageBreak/>
+        <w:t>Questão 13 Update - Problema:</w:t>
       </w:r>
     </w:p>
     <w:p>
@@ -1801,6 +3456,513 @@
           <w:lang w:eastAsia="pt-BR"/>
         </w:rPr>
         <w:t>Atualizar o salário fixo de todos os vendedores em 27% mais uma bonificação de R$ 100,00.</w:t>
+      </w:r>
+    </w:p>
+    <w:p>
+      <w:pPr>
+        <w:rPr>
+          <w:noProof/>
+          <w:lang w:eastAsia="pt-BR"/>
+        </w:rPr>
+      </w:pPr>
+      <w:hyperlink r:id="rId32" w:tgtFrame="mysql_doc" w:history="1">
+        <w:r>
+          <w:rPr>
+            <w:rStyle w:val="Hyperlink"/>
+            <w:noProof/>
+            <w:lang w:eastAsia="pt-BR"/>
+          </w:rPr>
+          <w:t>SELECT</w:t>
+        </w:r>
+      </w:hyperlink>
+      <w:r>
+        <w:rPr>
+          <w:noProof/>
+          <w:lang w:eastAsia="pt-BR"/>
+        </w:rPr>
+        <w:t xml:space="preserve"> * FROM `vendedor`</w:t>
+      </w:r>
+    </w:p>
+    <w:p>
+      <w:pPr>
+        <w:ind w:firstLine="0"/>
+        <w:rPr>
+          <w:noProof/>
+          <w:lang w:eastAsia="pt-BR"/>
+        </w:rPr>
+      </w:pPr>
+      <w:r>
+        <w:rPr>
+          <w:noProof/>
+          <w:lang w:eastAsia="pt-BR"/>
+        </w:rPr>
+        <w:drawing>
+          <wp:inline distT="0" distB="0" distL="0" distR="0" wp14:anchorId="7F2C8893" wp14:editId="400B05AA">
+            <wp:extent cx="5760085" cy="1391285"/>
+            <wp:effectExtent l="0" t="0" r="0" b="0"/>
+            <wp:docPr id="14" name="Imagem 14"/>
+            <wp:cNvGraphicFramePr>
+              <a:graphicFrameLocks xmlns:a="http://schemas.openxmlformats.org/drawingml/2006/main" noChangeAspect="1"/>
+            </wp:cNvGraphicFramePr>
+            <a:graphic xmlns:a="http://schemas.openxmlformats.org/drawingml/2006/main">
+              <a:graphicData uri="http://schemas.openxmlformats.org/drawingml/2006/picture">
+                <pic:pic xmlns:pic="http://schemas.openxmlformats.org/drawingml/2006/picture">
+                  <pic:nvPicPr>
+                    <pic:cNvPr id="1" name=""/>
+                    <pic:cNvPicPr/>
+                  </pic:nvPicPr>
+                  <pic:blipFill>
+                    <a:blip r:embed="rId33"/>
+                    <a:stretch>
+                      <a:fillRect/>
+                    </a:stretch>
+                  </pic:blipFill>
+                  <pic:spPr>
+                    <a:xfrm>
+                      <a:off x="0" y="0"/>
+                      <a:ext cx="5760085" cy="1391285"/>
+                    </a:xfrm>
+                    <a:prstGeom prst="rect">
+                      <a:avLst/>
+                    </a:prstGeom>
+                  </pic:spPr>
+                </pic:pic>
+              </a:graphicData>
+            </a:graphic>
+          </wp:inline>
+        </w:drawing>
+      </w:r>
+    </w:p>
+    <w:p>
+      <w:pPr>
+        <w:rPr>
+          <w:noProof/>
+          <w:lang w:eastAsia="pt-BR"/>
+        </w:rPr>
+      </w:pPr>
+    </w:p>
+    <w:p>
+      <w:pPr>
+        <w:rPr>
+          <w:noProof/>
+          <w:lang w:eastAsia="pt-BR"/>
+        </w:rPr>
+      </w:pPr>
+    </w:p>
+    <w:p>
+      <w:pPr>
+        <w:rPr>
+          <w:noProof/>
+          <w:lang w:eastAsia="pt-BR"/>
+        </w:rPr>
+      </w:pPr>
+    </w:p>
+    <w:p>
+      <w:pPr>
+        <w:rPr>
+          <w:noProof/>
+          <w:lang w:eastAsia="pt-BR"/>
+        </w:rPr>
+      </w:pPr>
+    </w:p>
+    <w:p>
+      <w:pPr>
+        <w:rPr>
+          <w:noProof/>
+          <w:lang w:eastAsia="pt-BR"/>
+        </w:rPr>
+      </w:pPr>
+    </w:p>
+    <w:p>
+      <w:pPr>
+        <w:rPr>
+          <w:noProof/>
+          <w:lang w:eastAsia="pt-BR"/>
+        </w:rPr>
+      </w:pPr>
+    </w:p>
+    <w:p>
+      <w:pPr>
+        <w:rPr>
+          <w:noProof/>
+          <w:lang w:eastAsia="pt-BR"/>
+        </w:rPr>
+      </w:pPr>
+    </w:p>
+    <w:p>
+      <w:pPr>
+        <w:rPr>
+          <w:noProof/>
+          <w:lang w:eastAsia="pt-BR"/>
+        </w:rPr>
+      </w:pPr>
+    </w:p>
+    <w:p>
+      <w:pPr>
+        <w:rPr>
+          <w:noProof/>
+          <w:lang w:eastAsia="pt-BR"/>
+        </w:rPr>
+      </w:pPr>
+    </w:p>
+    <w:p>
+      <w:pPr>
+        <w:rPr>
+          <w:noProof/>
+          <w:lang w:eastAsia="pt-BR"/>
+        </w:rPr>
+      </w:pPr>
+    </w:p>
+    <w:p>
+      <w:pPr>
+        <w:rPr>
+          <w:noProof/>
+          <w:lang w:eastAsia="pt-BR"/>
+        </w:rPr>
+      </w:pPr>
+    </w:p>
+    <w:p>
+      <w:pPr>
+        <w:spacing w:line="278" w:lineRule="auto"/>
+        <w:ind w:firstLine="0"/>
+        <w:jc w:val="left"/>
+        <w:rPr>
+          <w:noProof/>
+          <w:lang w:eastAsia="pt-BR"/>
+        </w:rPr>
+      </w:pPr>
+      <w:r>
+        <w:rPr>
+          <w:noProof/>
+          <w:lang w:eastAsia="pt-BR"/>
+        </w:rPr>
+        <w:br w:type="page"/>
+      </w:r>
+    </w:p>
+    <w:p>
+      <w:pPr>
+        <w:rPr>
+          <w:b/>
+          <w:bCs/>
+          <w:noProof/>
+          <w:lang w:eastAsia="pt-BR"/>
+        </w:rPr>
+      </w:pPr>
+      <w:r>
+        <w:rPr>
+          <w:b/>
+          <w:bCs/>
+          <w:noProof/>
+          <w:lang w:eastAsia="pt-BR"/>
+        </w:rPr>
+        <w:lastRenderedPageBreak/>
+        <w:t>Visões</w:t>
+      </w:r>
+    </w:p>
+    <w:p>
+      <w:pPr>
+        <w:rPr>
+          <w:noProof/>
+          <w:lang w:eastAsia="pt-BR"/>
+        </w:rPr>
+      </w:pPr>
+      <w:r>
+        <w:rPr>
+          <w:noProof/>
+          <w:lang w:eastAsia="pt-BR"/>
+        </w:rPr>
+        <w:t>Considerações sobre segurança podem exigir que determinados dados não estejam disponíveis para alguns usuários. Logo, não é desejável que o modelo lógico possa ser acessado indiscriminadamente. Com base nas questões de segurança, podemos criar uma coleção de relações personalizadas que se ajustem melhor às necessidades dos usuários e que levem em conta as questões de segurança. Tais relações são chamadas de visões.</w:t>
+      </w:r>
+    </w:p>
+    <w:p>
+      <w:pPr>
+        <w:rPr>
+          <w:noProof/>
+          <w:lang w:eastAsia="pt-BR"/>
+        </w:rPr>
+      </w:pPr>
+      <w:r>
+        <w:rPr>
+          <w:noProof/>
+          <w:lang w:eastAsia="pt-BR"/>
+        </w:rPr>
+        <w:t>Uma visão, na terminologia SQL, é uma tabela que é derivada de outras tabelas. Estas outras tabelas podem ser tabelas-base (criadas através do comando CREATE TABLE) ou outras visões previamente definidas. Uma visão não está, necessariamente, fisicamente armazenada no banco de dados; ela pode existir apenas virtualmente, em contraste com as tabelas-base, cujas as tuplas se encontram fisicamente armazenadas no banco de dados.</w:t>
+      </w:r>
+    </w:p>
+    <w:p>
+      <w:pPr>
+        <w:rPr>
+          <w:b/>
+          <w:bCs/>
+          <w:noProof/>
+          <w:lang w:eastAsia="pt-BR"/>
+        </w:rPr>
+      </w:pPr>
+      <w:r>
+        <w:rPr>
+          <w:b/>
+          <w:bCs/>
+          <w:noProof/>
+          <w:lang w:eastAsia="pt-BR"/>
+        </w:rPr>
+        <w:t>9.1 Definindo Visões</w:t>
+      </w:r>
+    </w:p>
+    <w:p>
+      <w:pPr>
+        <w:rPr>
+          <w:noProof/>
+          <w:lang w:eastAsia="pt-BR"/>
+        </w:rPr>
+      </w:pPr>
+      <w:r>
+        <w:rPr>
+          <w:noProof/>
+          <w:lang w:eastAsia="pt-BR"/>
+        </w:rPr>
+        <w:t>Em SQL, uma visão é definida através do comando create view, cuja a forma geral é:</w:t>
+      </w:r>
+    </w:p>
+    <w:p>
+      <w:pPr>
+        <w:rPr>
+          <w:noProof/>
+          <w:lang w:eastAsia="pt-BR"/>
+        </w:rPr>
+      </w:pPr>
+      <w:r>
+        <w:rPr>
+          <w:noProof/>
+          <w:lang w:eastAsia="pt-BR"/>
+        </w:rPr>
+        <w:t>CREATE VIEW &lt;nome_visão&gt; (&lt;nomes das colunas&gt;)</w:t>
+      </w:r>
+    </w:p>
+    <w:p>
+      <w:pPr>
+        <w:rPr>
+          <w:noProof/>
+          <w:lang w:eastAsia="pt-BR"/>
+        </w:rPr>
+      </w:pPr>
+      <w:r>
+        <w:rPr>
+          <w:noProof/>
+          <w:lang w:eastAsia="pt-BR"/>
+        </w:rPr>
+        <w:t>AS &lt;expressão_de_consulta&gt;;</w:t>
+      </w:r>
+    </w:p>
+    <w:p>
+      <w:pPr>
+        <w:rPr>
+          <w:noProof/>
+          <w:lang w:eastAsia="pt-BR"/>
+        </w:rPr>
+      </w:pPr>
+    </w:p>
+    <w:p>
+      <w:pPr>
+        <w:rPr>
+          <w:b/>
+          <w:bCs/>
+          <w:noProof/>
+          <w:lang w:eastAsia="pt-BR"/>
+        </w:rPr>
+      </w:pPr>
+      <w:r>
+        <w:rPr>
+          <w:b/>
+          <w:bCs/>
+          <w:noProof/>
+          <w:lang w:eastAsia="pt-BR"/>
+        </w:rPr>
+        <w:t xml:space="preserve">Questão </w:t>
+      </w:r>
+      <w:r>
+        <w:rPr>
+          <w:b/>
+          <w:bCs/>
+          <w:noProof/>
+          <w:lang w:eastAsia="pt-BR"/>
+        </w:rPr>
+        <w:t>14</w:t>
+      </w:r>
+      <w:r>
+        <w:rPr>
+          <w:b/>
+          <w:bCs/>
+          <w:noProof/>
+          <w:lang w:eastAsia="pt-BR"/>
+        </w:rPr>
+        <w:t xml:space="preserve"> </w:t>
+      </w:r>
+      <w:r>
+        <w:rPr>
+          <w:b/>
+          <w:bCs/>
+          <w:noProof/>
+          <w:lang w:eastAsia="pt-BR"/>
+        </w:rPr>
+        <w:t>view</w:t>
+      </w:r>
+      <w:r>
+        <w:rPr>
+          <w:b/>
+          <w:bCs/>
+          <w:noProof/>
+          <w:lang w:eastAsia="pt-BR"/>
+        </w:rPr>
+        <w:t xml:space="preserve"> - Problema:</w:t>
+      </w:r>
+    </w:p>
+    <w:p>
+      <w:pPr>
+        <w:rPr>
+          <w:noProof/>
+          <w:lang w:eastAsia="pt-BR"/>
+        </w:rPr>
+      </w:pPr>
+      <w:r>
+        <w:rPr>
+          <w:noProof/>
+          <w:lang w:eastAsia="pt-BR"/>
+        </w:rPr>
+        <w:t>Criar uma visão que contenha apenas os produtos vendidos em quilograma.</w:t>
+      </w:r>
+    </w:p>
+    <w:p>
+      <w:pPr>
+        <w:rPr>
+          <w:noProof/>
+          <w:lang w:eastAsia="pt-BR"/>
+        </w:rPr>
+      </w:pPr>
+      <w:r>
+        <w:rPr>
+          <w:noProof/>
+          <w:lang w:eastAsia="pt-BR"/>
+        </w:rPr>
+        <w:t>Código:</w:t>
+      </w:r>
+    </w:p>
+    <w:p>
+      <w:pPr>
+        <w:rPr>
+          <w:noProof/>
+          <w:lang w:eastAsia="pt-BR"/>
+        </w:rPr>
+      </w:pPr>
+      <w:r>
+        <w:rPr>
+          <w:noProof/>
+          <w:lang w:eastAsia="pt-BR"/>
+        </w:rPr>
+        <w:t>CREATE VIEW produtos_quilograma AS</w:t>
+      </w:r>
+    </w:p>
+    <w:p>
+      <w:pPr>
+        <w:rPr>
+          <w:noProof/>
+          <w:lang w:eastAsia="pt-BR"/>
+        </w:rPr>
+      </w:pPr>
+      <w:r>
+        <w:rPr>
+          <w:noProof/>
+          <w:lang w:eastAsia="pt-BR"/>
+        </w:rPr>
+        <w:t>SELECT cod_prod, unid_prod, desc_prod, val_unit</w:t>
+      </w:r>
+    </w:p>
+    <w:p>
+      <w:pPr>
+        <w:rPr>
+          <w:noProof/>
+          <w:lang w:eastAsia="pt-BR"/>
+        </w:rPr>
+      </w:pPr>
+      <w:r>
+        <w:rPr>
+          <w:noProof/>
+          <w:lang w:eastAsia="pt-BR"/>
+        </w:rPr>
+        <w:t>FROM produto</w:t>
+      </w:r>
+    </w:p>
+    <w:p>
+      <w:pPr>
+        <w:rPr>
+          <w:noProof/>
+          <w:lang w:eastAsia="pt-BR"/>
+        </w:rPr>
+      </w:pPr>
+      <w:r>
+        <w:rPr>
+          <w:noProof/>
+          <w:lang w:eastAsia="pt-BR"/>
+        </w:rPr>
+        <w:t>WHERE unid_prod = 'kg';</w:t>
+      </w:r>
+    </w:p>
+    <w:p>
+      <w:pPr>
+        <w:rPr>
+          <w:noProof/>
+          <w:lang w:eastAsia="pt-BR"/>
+        </w:rPr>
+      </w:pPr>
+    </w:p>
+    <w:p>
+      <w:pPr>
+        <w:ind w:firstLine="0"/>
+        <w:rPr>
+          <w:noProof/>
+          <w:lang w:eastAsia="pt-BR"/>
+        </w:rPr>
+      </w:pPr>
+      <w:r>
+        <w:rPr>
+          <w:noProof/>
+          <w:lang w:eastAsia="pt-BR"/>
+        </w:rPr>
+        <w:lastRenderedPageBreak/>
+        <w:drawing>
+          <wp:inline distT="0" distB="0" distL="0" distR="0" wp14:anchorId="10DD92C3" wp14:editId="7A7D95A6">
+            <wp:extent cx="5760085" cy="2466975"/>
+            <wp:effectExtent l="0" t="0" r="0" b="9525"/>
+            <wp:docPr id="15" name="Imagem 15"/>
+            <wp:cNvGraphicFramePr>
+              <a:graphicFrameLocks xmlns:a="http://schemas.openxmlformats.org/drawingml/2006/main" noChangeAspect="1"/>
+            </wp:cNvGraphicFramePr>
+            <a:graphic xmlns:a="http://schemas.openxmlformats.org/drawingml/2006/main">
+              <a:graphicData uri="http://schemas.openxmlformats.org/drawingml/2006/picture">
+                <pic:pic xmlns:pic="http://schemas.openxmlformats.org/drawingml/2006/picture">
+                  <pic:nvPicPr>
+                    <pic:cNvPr id="1" name=""/>
+                    <pic:cNvPicPr/>
+                  </pic:nvPicPr>
+                  <pic:blipFill>
+                    <a:blip r:embed="rId34"/>
+                    <a:stretch>
+                      <a:fillRect/>
+                    </a:stretch>
+                  </pic:blipFill>
+                  <pic:spPr>
+                    <a:xfrm>
+                      <a:off x="0" y="0"/>
+                      <a:ext cx="5760085" cy="2466975"/>
+                    </a:xfrm>
+                    <a:prstGeom prst="rect">
+                      <a:avLst/>
+                    </a:prstGeom>
+                  </pic:spPr>
+                </pic:pic>
+              </a:graphicData>
+            </a:graphic>
+          </wp:inline>
+        </w:drawing>
       </w:r>
     </w:p>
     <w:sectPr>
@@ -2568,7 +4730,6 @@
   <w:style w:type="character" w:default="1" w:styleId="Fontepargpadro">
     <w:name w:val="Default Paragraph Font"/>
     <w:uiPriority w:val="1"/>
-    <w:semiHidden/>
     <w:unhideWhenUsed/>
   </w:style>
   <w:style w:type="table" w:default="1" w:styleId="Tabelanormal">

</xml_diff>